<commit_message>
feat: atualizar requisitos do chatbot para uso de comando de voz com novas prioridades
</commit_message>
<xml_diff>
--- a/docs/Visao_e_Requisitos_Chatbot_Comando_de_Voz.docx
+++ b/docs/Visao_e_Requisitos_Chatbot_Comando_de_Voz.docx
@@ -1266,7 +1266,7 @@
                 <w:color w:val="0B2545"/>
                 <w:sz w:val="18"/>
               </w:rPr>
-              <w:t>Must</w:t>
+              <w:t>Obrigatória (Alta)</w:t>
             </w:r>
           </w:p>
         </w:tc>
@@ -1331,7 +1331,7 @@
                 <w:color w:val="0B2545"/>
                 <w:sz w:val="18"/>
               </w:rPr>
-              <w:t>Must</w:t>
+              <w:t>Obrigatória (Alta)</w:t>
             </w:r>
           </w:p>
         </w:tc>
@@ -1396,7 +1396,7 @@
                 <w:color w:val="0B2545"/>
                 <w:sz w:val="18"/>
               </w:rPr>
-              <w:t>Must</w:t>
+              <w:t>Obrigatória (Alta)</w:t>
             </w:r>
           </w:p>
         </w:tc>
@@ -1461,7 +1461,7 @@
                 <w:color w:val="0B2545"/>
                 <w:sz w:val="18"/>
               </w:rPr>
-              <w:t>Must</w:t>
+              <w:t>Obrigatória (Alta)</w:t>
             </w:r>
           </w:p>
         </w:tc>
@@ -1526,7 +1526,7 @@
                 <w:color w:val="0B2545"/>
                 <w:sz w:val="18"/>
               </w:rPr>
-              <w:t>Must</w:t>
+              <w:t>Obrigatória (Alta)</w:t>
             </w:r>
           </w:p>
         </w:tc>
@@ -1591,7 +1591,7 @@
                 <w:color w:val="0B2545"/>
                 <w:sz w:val="18"/>
               </w:rPr>
-              <w:t>Must</w:t>
+              <w:t>Obrigatória (Alta)</w:t>
             </w:r>
           </w:p>
         </w:tc>
@@ -1656,7 +1656,7 @@
                 <w:color w:val="0B2545"/>
                 <w:sz w:val="18"/>
               </w:rPr>
-              <w:t>Must</w:t>
+              <w:t>Obrigatória (Alta)</w:t>
             </w:r>
           </w:p>
         </w:tc>
@@ -1721,7 +1721,7 @@
                 <w:color w:val="0B2545"/>
                 <w:sz w:val="18"/>
               </w:rPr>
-              <w:t>Must</w:t>
+              <w:t>Obrigatória (Alta)</w:t>
             </w:r>
           </w:p>
         </w:tc>
@@ -1786,7 +1786,7 @@
                 <w:color w:val="0B2545"/>
                 <w:sz w:val="18"/>
               </w:rPr>
-              <w:t>Must</w:t>
+              <w:t>Obrigatória (Alta)</w:t>
             </w:r>
           </w:p>
         </w:tc>
@@ -1851,7 +1851,7 @@
                 <w:color w:val="0B2545"/>
                 <w:sz w:val="18"/>
               </w:rPr>
-              <w:t>Must</w:t>
+              <w:t>Obrigatória (Alta)</w:t>
             </w:r>
           </w:p>
         </w:tc>
@@ -1916,7 +1916,7 @@
                 <w:color w:val="0B2545"/>
                 <w:sz w:val="18"/>
               </w:rPr>
-              <w:t>Must</w:t>
+              <w:t>Obrigatória (Alta)</w:t>
             </w:r>
           </w:p>
         </w:tc>
@@ -1981,7 +1981,7 @@
                 <w:color w:val="0B2545"/>
                 <w:sz w:val="18"/>
               </w:rPr>
-              <w:t>Must</w:t>
+              <w:t>Obrigatória (Alta)</w:t>
             </w:r>
           </w:p>
         </w:tc>
@@ -2046,7 +2046,7 @@
                 <w:color w:val="0B2545"/>
                 <w:sz w:val="18"/>
               </w:rPr>
-              <w:t>Must</w:t>
+              <w:t>Obrigatória (Alta)</w:t>
             </w:r>
           </w:p>
         </w:tc>
@@ -2111,7 +2111,7 @@
                 <w:color w:val="0B2545"/>
                 <w:sz w:val="18"/>
               </w:rPr>
-              <w:t>Must</w:t>
+              <w:t>Obrigatória (Alta)</w:t>
             </w:r>
           </w:p>
         </w:tc>
@@ -2176,7 +2176,7 @@
                 <w:color w:val="0B2545"/>
                 <w:sz w:val="18"/>
               </w:rPr>
-              <w:t>Must</w:t>
+              <w:t>Obrigatória (Alta)</w:t>
             </w:r>
           </w:p>
         </w:tc>
@@ -2241,7 +2241,7 @@
                 <w:color w:val="0B2545"/>
                 <w:sz w:val="18"/>
               </w:rPr>
-              <w:t>Must</w:t>
+              <w:t>Obrigatória (Alta)</w:t>
             </w:r>
           </w:p>
         </w:tc>
@@ -2306,7 +2306,7 @@
                 <w:color w:val="0B2545"/>
                 <w:sz w:val="18"/>
               </w:rPr>
-              <w:t>Should</w:t>
+              <w:t>Importante (Média)</w:t>
             </w:r>
           </w:p>
         </w:tc>
@@ -2371,7 +2371,7 @@
                 <w:color w:val="0B2545"/>
                 <w:sz w:val="18"/>
               </w:rPr>
-              <w:t>Must</w:t>
+              <w:t>Obrigatória (Alta)</w:t>
             </w:r>
           </w:p>
         </w:tc>
@@ -2436,7 +2436,7 @@
                 <w:color w:val="0B2545"/>
                 <w:sz w:val="18"/>
               </w:rPr>
-              <w:t>Should</w:t>
+              <w:t>Importante (Média)</w:t>
             </w:r>
           </w:p>
         </w:tc>
@@ -4071,7 +4071,7 @@
                 <w:color w:val="0B2545"/>
                 <w:sz w:val="18"/>
               </w:rPr>
-              <w:t>Must</w:t>
+              <w:t>Obrigatória (Alta)</w:t>
             </w:r>
           </w:p>
         </w:tc>
@@ -4157,7 +4157,7 @@
                 <w:color w:val="0B2545"/>
                 <w:sz w:val="18"/>
               </w:rPr>
-              <w:t>Must</w:t>
+              <w:t>Obrigatória (Alta)</w:t>
             </w:r>
           </w:p>
         </w:tc>
@@ -4243,7 +4243,7 @@
                 <w:color w:val="0B2545"/>
                 <w:sz w:val="18"/>
               </w:rPr>
-              <w:t>Must</w:t>
+              <w:t>Obrigatória (Alta)</w:t>
             </w:r>
           </w:p>
         </w:tc>
@@ -4329,7 +4329,7 @@
                 <w:color w:val="0B2545"/>
                 <w:sz w:val="18"/>
               </w:rPr>
-              <w:t>Must</w:t>
+              <w:t>Obrigatória (Alta)</w:t>
             </w:r>
           </w:p>
         </w:tc>
@@ -4415,7 +4415,7 @@
                 <w:color w:val="0B2545"/>
                 <w:sz w:val="18"/>
               </w:rPr>
-              <w:t>Must</w:t>
+              <w:t>Obrigatória (Alta)</w:t>
             </w:r>
           </w:p>
         </w:tc>
@@ -4501,7 +4501,7 @@
                 <w:color w:val="0B2545"/>
                 <w:sz w:val="18"/>
               </w:rPr>
-              <w:t>Must</w:t>
+              <w:t>Obrigatória (Alta)</w:t>
             </w:r>
           </w:p>
         </w:tc>
@@ -4587,7 +4587,7 @@
                 <w:color w:val="0B2545"/>
                 <w:sz w:val="18"/>
               </w:rPr>
-              <w:t>Must</w:t>
+              <w:t>Obrigatória (Alta)</w:t>
             </w:r>
           </w:p>
         </w:tc>
@@ -4673,7 +4673,7 @@
                 <w:color w:val="0B2545"/>
                 <w:sz w:val="18"/>
               </w:rPr>
-              <w:t>Must</w:t>
+              <w:t>Obrigatória (Alta)</w:t>
             </w:r>
           </w:p>
         </w:tc>
@@ -4759,7 +4759,7 @@
                 <w:color w:val="0B2545"/>
                 <w:sz w:val="18"/>
               </w:rPr>
-              <w:t>Must</w:t>
+              <w:t>Obrigatória (Alta)</w:t>
             </w:r>
           </w:p>
         </w:tc>
@@ -4845,7 +4845,7 @@
                 <w:color w:val="0B2545"/>
                 <w:sz w:val="18"/>
               </w:rPr>
-              <w:t>Must</w:t>
+              <w:t>Obrigatória (Alta)</w:t>
             </w:r>
           </w:p>
         </w:tc>
@@ -4931,7 +4931,7 @@
                 <w:color w:val="0B2545"/>
                 <w:sz w:val="18"/>
               </w:rPr>
-              <w:t>Should</w:t>
+              <w:t>Importante (Média)</w:t>
             </w:r>
           </w:p>
         </w:tc>
@@ -5017,7 +5017,7 @@
                 <w:color w:val="0B2545"/>
                 <w:sz w:val="18"/>
               </w:rPr>
-              <w:t>Must</w:t>
+              <w:t>Obrigatória (Alta)</w:t>
             </w:r>
           </w:p>
         </w:tc>

</xml_diff>

<commit_message>
feat: adicionar planejamento das entregas e requisitos para chatbot multimodal e comando de voz
</commit_message>
<xml_diff>
--- a/docs/Visao_e_Requisitos_Chatbot_Comando_de_Voz.docx
+++ b/docs/Visao_e_Requisitos_Chatbot_Comando_de_Voz.docx
@@ -70,7 +70,7 @@
           <w:color w:val="0B2545"/>
           <w:sz w:val="21"/>
         </w:rPr>
-        <w:t>1.0</w:t>
+        <w:t>1.1</w:t>
       </w:r>
     </w:p>
     <w:p>
@@ -92,7 +92,7 @@
           <w:color w:val="0B2545"/>
           <w:sz w:val="21"/>
         </w:rPr>
-        <w:t>Proposta para planejamento acadêmico</w:t>
+        <w:t>Planejamento das entregas acadêmicas</w:t>
       </w:r>
     </w:p>
     <w:p>
@@ -5525,6 +5525,4324 @@
       <w:pPr>
         <w:spacing w:after="40"/>
       </w:pPr>
+    </w:p>
+    <w:p>
+      <w:r>
+        <w:br w:type="page"/>
+      </w:r>
+    </w:p>
+    <w:p>
+      <w:pPr>
+        <w:pStyle w:val="Heading1"/>
+        <w:keepNext/>
+      </w:pPr>
+      <w:r>
+        <w:t>12. Planejamento das entregas</w:t>
+      </w:r>
+    </w:p>
+    <w:tbl>
+      <w:tblPr>
+        <w:tblW w:type="dxa" w:w="9360"/>
+        <w:jc w:val="left"/>
+        <w:tblLayout w:type="fixed"/>
+        <w:tblLook w:firstColumn="1" w:firstRow="1" w:lastColumn="0" w:lastRow="0" w:noHBand="0" w:noVBand="1" w:val="04A0"/>
+        <w:tblInd w:w="120" w:type="dxa"/>
+      </w:tblPr>
+      <w:tblGrid>
+        <w:gridCol w:w="9360"/>
+      </w:tblGrid>
+      <w:tr>
+        <w:tc>
+          <w:tcPr>
+            <w:tcW w:type="dxa" w:w="9360"/>
+            <w:vAlign w:val="center"/>
+            <w:tcMar>
+              <w:top w:w="80" w:type="dxa"/>
+              <w:start w:w="120" w:type="dxa"/>
+              <w:bottom w:w="80" w:type="dxa"/>
+              <w:end w:w="120" w:type="dxa"/>
+            </w:tcMar>
+            <w:shd w:fill="F4F6F9"/>
+          </w:tcPr>
+          <w:p>
+            <w:pPr>
+              <w:spacing w:before="40" w:after="40" w:line="264" w:lineRule="auto"/>
+            </w:pPr>
+            <w:r/>
+            <w:r>
+              <w:rPr>
+                <w:rFonts w:ascii="Calibri" w:hAnsi="Calibri"/>
+                <w:b/>
+                <w:color w:val="1F4D78"/>
+                <w:sz w:val="20"/>
+              </w:rPr>
+              <w:t xml:space="preserve">Estratégia: </w:t>
+            </w:r>
+            <w:r>
+              <w:rPr>
+                <w:rFonts w:ascii="Calibri" w:hAnsi="Calibri"/>
+                <w:color w:val="0B2545"/>
+                <w:sz w:val="20"/>
+              </w:rPr>
+              <w:t>a primeira entrega comprova o pipeline de voz e PLN com busca semântica. A segunda reutiliza esse núcleo para concluir os fluxos conversacionais e as regras de agendamento.</w:t>
+            </w:r>
+          </w:p>
+        </w:tc>
+      </w:tr>
+    </w:tbl>
+    <w:p>
+      <w:pPr>
+        <w:spacing w:after="40"/>
+      </w:pPr>
+    </w:p>
+    <w:p>
+      <w:pPr>
+        <w:pStyle w:val="Heading2"/>
+        <w:keepNext/>
+      </w:pPr>
+      <w:r>
+        <w:t>12.1 Primeira entrega - Comando de voz e busca semântica</w:t>
+      </w:r>
+    </w:p>
+    <w:p>
+      <w:pPr/>
+      <w:r>
+        <w:rPr>
+          <w:rFonts w:ascii="Calibri" w:hAnsi="Calibri"/>
+          <w:b/>
+          <w:color w:val="0B2545"/>
+        </w:rPr>
+        <w:t xml:space="preserve">Prazo: </w:t>
+      </w:r>
+      <w:r>
+        <w:rPr>
+          <w:rFonts w:ascii="Calibri" w:hAnsi="Calibri"/>
+          <w:color w:val="0B2545"/>
+        </w:rPr>
+        <w:t>Prazo informado: 21 de setembro.</w:t>
+      </w:r>
+    </w:p>
+    <w:p>
+      <w:pPr/>
+      <w:r>
+        <w:rPr>
+          <w:rFonts w:ascii="Calibri" w:hAnsi="Calibri"/>
+          <w:b/>
+          <w:color w:val="0B2545"/>
+        </w:rPr>
+        <w:t xml:space="preserve">Objetivo: </w:t>
+      </w:r>
+      <w:r>
+        <w:rPr>
+          <w:rFonts w:ascii="Calibri" w:hAnsi="Calibri"/>
+          <w:color w:val="0B2545"/>
+        </w:rPr>
+        <w:t>Entregar um protótipo funcional que receba voz em web e mobile, converta-a em texto, execute o pipeline de PLN clássico e retorne serviços relevantes por busca semântica.</w:t>
+      </w:r>
+    </w:p>
+    <w:p>
+      <w:pPr/>
+      <w:r>
+        <w:rPr>
+          <w:rFonts w:ascii="Calibri" w:hAnsi="Calibri"/>
+          <w:b/>
+          <w:color w:val="0B2545"/>
+        </w:rPr>
+        <w:t xml:space="preserve">Pipeline demonstrável: </w:t>
+      </w:r>
+      <w:r>
+        <w:rPr>
+          <w:rFonts w:ascii="Calibri" w:hAnsi="Calibri"/>
+          <w:color w:val="0B2545"/>
+        </w:rPr>
+        <w:t>Voz -&gt; reconhecimento de fala -&gt; texto -&gt; normalização/tokenização/stemming -&gt; classificação de intenção -&gt; extração de entidades -&gt; busca semântica -&gt; resultados relevantes.</w:t>
+      </w:r>
+    </w:p>
+    <w:p>
+      <w:pPr>
+        <w:pStyle w:val="Heading3"/>
+        <w:keepNext/>
+      </w:pPr>
+      <w:r>
+        <w:t>Requisitos funcionais da primeira entrega</w:t>
+      </w:r>
+    </w:p>
+    <w:tbl>
+      <w:tblPr>
+        <w:tblW w:type="dxa" w:w="9360"/>
+        <w:jc w:val="left"/>
+        <w:tblLayout w:type="fixed"/>
+        <w:tblLook w:firstColumn="1" w:firstRow="1" w:lastColumn="0" w:lastRow="0" w:noHBand="0" w:noVBand="1" w:val="04A0"/>
+        <w:tblInd w:w="120" w:type="dxa"/>
+      </w:tblPr>
+      <w:tblGrid>
+        <w:gridCol w:w="1050"/>
+        <w:gridCol w:w="6620"/>
+        <w:gridCol w:w="1690"/>
+      </w:tblGrid>
+      <w:tr>
+        <w:trPr>
+          <w:tblHeader w:val="true"/>
+        </w:trPr>
+        <w:tc>
+          <w:tcPr>
+            <w:tcW w:type="dxa" w:w="1050"/>
+            <w:vAlign w:val="center"/>
+            <w:tcMar>
+              <w:top w:w="80" w:type="dxa"/>
+              <w:start w:w="120" w:type="dxa"/>
+              <w:bottom w:w="80" w:type="dxa"/>
+              <w:end w:w="120" w:type="dxa"/>
+            </w:tcMar>
+            <w:shd w:fill="F2F4F7"/>
+          </w:tcPr>
+          <w:p>
+            <w:pPr>
+              <w:spacing w:before="0" w:after="0" w:line="259" w:lineRule="auto"/>
+              <w:jc w:val="center"/>
+            </w:pPr>
+            <w:r/>
+            <w:r>
+              <w:rPr>
+                <w:rFonts w:ascii="Calibri" w:hAnsi="Calibri"/>
+                <w:b/>
+                <w:color w:val="1F4D78"/>
+                <w:sz w:val="18"/>
+              </w:rPr>
+              <w:t>ID</w:t>
+            </w:r>
+          </w:p>
+        </w:tc>
+        <w:tc>
+          <w:tcPr>
+            <w:tcW w:type="dxa" w:w="6620"/>
+            <w:vAlign w:val="center"/>
+            <w:tcMar>
+              <w:top w:w="80" w:type="dxa"/>
+              <w:start w:w="120" w:type="dxa"/>
+              <w:bottom w:w="80" w:type="dxa"/>
+              <w:end w:w="120" w:type="dxa"/>
+            </w:tcMar>
+            <w:shd w:fill="F2F4F7"/>
+          </w:tcPr>
+          <w:p>
+            <w:pPr>
+              <w:spacing w:before="0" w:after="0" w:line="259" w:lineRule="auto"/>
+              <w:jc w:val="left"/>
+            </w:pPr>
+            <w:r/>
+            <w:r>
+              <w:rPr>
+                <w:rFonts w:ascii="Calibri" w:hAnsi="Calibri"/>
+                <w:b/>
+                <w:color w:val="1F4D78"/>
+                <w:sz w:val="18"/>
+              </w:rPr>
+              <w:t>Requisito</w:t>
+            </w:r>
+          </w:p>
+        </w:tc>
+        <w:tc>
+          <w:tcPr>
+            <w:tcW w:type="dxa" w:w="1690"/>
+            <w:vAlign w:val="center"/>
+            <w:tcMar>
+              <w:top w:w="80" w:type="dxa"/>
+              <w:start w:w="120" w:type="dxa"/>
+              <w:bottom w:w="80" w:type="dxa"/>
+              <w:end w:w="120" w:type="dxa"/>
+            </w:tcMar>
+            <w:shd w:fill="F2F4F7"/>
+          </w:tcPr>
+          <w:p>
+            <w:pPr>
+              <w:spacing w:before="0" w:after="0" w:line="259" w:lineRule="auto"/>
+              <w:jc w:val="center"/>
+            </w:pPr>
+            <w:r/>
+            <w:r>
+              <w:rPr>
+                <w:rFonts w:ascii="Calibri" w:hAnsi="Calibri"/>
+                <w:b/>
+                <w:color w:val="1F4D78"/>
+                <w:sz w:val="18"/>
+              </w:rPr>
+              <w:t>Prioridade</w:t>
+            </w:r>
+          </w:p>
+        </w:tc>
+      </w:tr>
+      <w:tr>
+        <w:tc>
+          <w:tcPr>
+            <w:tcW w:type="dxa" w:w="1050"/>
+          </w:tcPr>
+          <w:p>
+            <w:pPr>
+              <w:spacing w:before="0" w:after="0" w:line="259" w:lineRule="auto"/>
+              <w:jc w:val="center"/>
+            </w:pPr>
+            <w:r/>
+            <w:r>
+              <w:rPr>
+                <w:rFonts w:ascii="Calibri" w:hAnsi="Calibri"/>
+                <w:b w:val="0"/>
+                <w:color w:val="0B2545"/>
+                <w:sz w:val="18"/>
+              </w:rPr>
+              <w:t>RF-V01</w:t>
+            </w:r>
+          </w:p>
+        </w:tc>
+        <w:tc>
+          <w:tcPr>
+            <w:tcW w:type="dxa" w:w="6620"/>
+          </w:tcPr>
+          <w:p>
+            <w:pPr>
+              <w:spacing w:before="0" w:after="0" w:line="259" w:lineRule="auto"/>
+              <w:jc w:val="left"/>
+            </w:pPr>
+            <w:r/>
+            <w:r>
+              <w:rPr>
+                <w:rFonts w:ascii="Calibri" w:hAnsi="Calibri"/>
+                <w:b w:val="0"/>
+                <w:color w:val="0B2545"/>
+                <w:sz w:val="18"/>
+              </w:rPr>
+              <w:t>Iniciar e parar gravação de voz em web e mobile.</w:t>
+            </w:r>
+          </w:p>
+        </w:tc>
+        <w:tc>
+          <w:tcPr>
+            <w:tcW w:type="dxa" w:w="1690"/>
+          </w:tcPr>
+          <w:p>
+            <w:pPr>
+              <w:spacing w:before="0" w:after="0" w:line="259" w:lineRule="auto"/>
+              <w:jc w:val="center"/>
+            </w:pPr>
+            <w:r/>
+            <w:r>
+              <w:rPr>
+                <w:rFonts w:ascii="Calibri" w:hAnsi="Calibri"/>
+                <w:b w:val="0"/>
+                <w:color w:val="0B2545"/>
+                <w:sz w:val="18"/>
+              </w:rPr>
+              <w:t>Obrigatória (Alta)</w:t>
+            </w:r>
+          </w:p>
+        </w:tc>
+      </w:tr>
+      <w:tr>
+        <w:tc>
+          <w:tcPr>
+            <w:tcW w:type="dxa" w:w="1050"/>
+          </w:tcPr>
+          <w:p>
+            <w:pPr>
+              <w:spacing w:before="0" w:after="0" w:line="259" w:lineRule="auto"/>
+              <w:jc w:val="center"/>
+            </w:pPr>
+            <w:r/>
+            <w:r>
+              <w:rPr>
+                <w:rFonts w:ascii="Calibri" w:hAnsi="Calibri"/>
+                <w:b w:val="0"/>
+                <w:color w:val="0B2545"/>
+                <w:sz w:val="18"/>
+              </w:rPr>
+              <w:t>RF-V02</w:t>
+            </w:r>
+          </w:p>
+        </w:tc>
+        <w:tc>
+          <w:tcPr>
+            <w:tcW w:type="dxa" w:w="6620"/>
+          </w:tcPr>
+          <w:p>
+            <w:pPr>
+              <w:spacing w:before="0" w:after="0" w:line="259" w:lineRule="auto"/>
+              <w:jc w:val="left"/>
+            </w:pPr>
+            <w:r/>
+            <w:r>
+              <w:rPr>
+                <w:rFonts w:ascii="Calibri" w:hAnsi="Calibri"/>
+                <w:b w:val="0"/>
+                <w:color w:val="0B2545"/>
+                <w:sz w:val="18"/>
+              </w:rPr>
+              <w:t>Solicitar permissão de microfone antes da gravação.</w:t>
+            </w:r>
+          </w:p>
+        </w:tc>
+        <w:tc>
+          <w:tcPr>
+            <w:tcW w:type="dxa" w:w="1690"/>
+          </w:tcPr>
+          <w:p>
+            <w:pPr>
+              <w:spacing w:before="0" w:after="0" w:line="259" w:lineRule="auto"/>
+              <w:jc w:val="center"/>
+            </w:pPr>
+            <w:r/>
+            <w:r>
+              <w:rPr>
+                <w:rFonts w:ascii="Calibri" w:hAnsi="Calibri"/>
+                <w:b w:val="0"/>
+                <w:color w:val="0B2545"/>
+                <w:sz w:val="18"/>
+              </w:rPr>
+              <w:t>Obrigatória (Alta)</w:t>
+            </w:r>
+          </w:p>
+        </w:tc>
+      </w:tr>
+      <w:tr>
+        <w:tc>
+          <w:tcPr>
+            <w:tcW w:type="dxa" w:w="1050"/>
+          </w:tcPr>
+          <w:p>
+            <w:pPr>
+              <w:spacing w:before="0" w:after="0" w:line="259" w:lineRule="auto"/>
+              <w:jc w:val="center"/>
+            </w:pPr>
+            <w:r/>
+            <w:r>
+              <w:rPr>
+                <w:rFonts w:ascii="Calibri" w:hAnsi="Calibri"/>
+                <w:b w:val="0"/>
+                <w:color w:val="0B2545"/>
+                <w:sz w:val="18"/>
+              </w:rPr>
+              <w:t>RF-V03</w:t>
+            </w:r>
+          </w:p>
+        </w:tc>
+        <w:tc>
+          <w:tcPr>
+            <w:tcW w:type="dxa" w:w="6620"/>
+          </w:tcPr>
+          <w:p>
+            <w:pPr>
+              <w:spacing w:before="0" w:after="0" w:line="259" w:lineRule="auto"/>
+              <w:jc w:val="left"/>
+            </w:pPr>
+            <w:r/>
+            <w:r>
+              <w:rPr>
+                <w:rFonts w:ascii="Calibri" w:hAnsi="Calibri"/>
+                <w:b w:val="0"/>
+                <w:color w:val="0B2545"/>
+                <w:sz w:val="18"/>
+              </w:rPr>
+              <w:t>Converter áudio em texto em português.</w:t>
+            </w:r>
+          </w:p>
+        </w:tc>
+        <w:tc>
+          <w:tcPr>
+            <w:tcW w:type="dxa" w:w="1690"/>
+          </w:tcPr>
+          <w:p>
+            <w:pPr>
+              <w:spacing w:before="0" w:after="0" w:line="259" w:lineRule="auto"/>
+              <w:jc w:val="center"/>
+            </w:pPr>
+            <w:r/>
+            <w:r>
+              <w:rPr>
+                <w:rFonts w:ascii="Calibri" w:hAnsi="Calibri"/>
+                <w:b w:val="0"/>
+                <w:color w:val="0B2545"/>
+                <w:sz w:val="18"/>
+              </w:rPr>
+              <w:t>Obrigatória (Alta)</w:t>
+            </w:r>
+          </w:p>
+        </w:tc>
+      </w:tr>
+      <w:tr>
+        <w:tc>
+          <w:tcPr>
+            <w:tcW w:type="dxa" w:w="1050"/>
+          </w:tcPr>
+          <w:p>
+            <w:pPr>
+              <w:spacing w:before="0" w:after="0" w:line="259" w:lineRule="auto"/>
+              <w:jc w:val="center"/>
+            </w:pPr>
+            <w:r/>
+            <w:r>
+              <w:rPr>
+                <w:rFonts w:ascii="Calibri" w:hAnsi="Calibri"/>
+                <w:b w:val="0"/>
+                <w:color w:val="0B2545"/>
+                <w:sz w:val="18"/>
+              </w:rPr>
+              <w:t>RF-V04</w:t>
+            </w:r>
+          </w:p>
+        </w:tc>
+        <w:tc>
+          <w:tcPr>
+            <w:tcW w:type="dxa" w:w="6620"/>
+          </w:tcPr>
+          <w:p>
+            <w:pPr>
+              <w:spacing w:before="0" w:after="0" w:line="259" w:lineRule="auto"/>
+              <w:jc w:val="left"/>
+            </w:pPr>
+            <w:r/>
+            <w:r>
+              <w:rPr>
+                <w:rFonts w:ascii="Calibri" w:hAnsi="Calibri"/>
+                <w:b w:val="0"/>
+                <w:color w:val="0B2545"/>
+                <w:sz w:val="18"/>
+              </w:rPr>
+              <w:t>Exibir a transcrição ao usuário.</w:t>
+            </w:r>
+          </w:p>
+        </w:tc>
+        <w:tc>
+          <w:tcPr>
+            <w:tcW w:type="dxa" w:w="1690"/>
+          </w:tcPr>
+          <w:p>
+            <w:pPr>
+              <w:spacing w:before="0" w:after="0" w:line="259" w:lineRule="auto"/>
+              <w:jc w:val="center"/>
+            </w:pPr>
+            <w:r/>
+            <w:r>
+              <w:rPr>
+                <w:rFonts w:ascii="Calibri" w:hAnsi="Calibri"/>
+                <w:b w:val="0"/>
+                <w:color w:val="0B2545"/>
+                <w:sz w:val="18"/>
+              </w:rPr>
+              <w:t>Obrigatória (Alta)</w:t>
+            </w:r>
+          </w:p>
+        </w:tc>
+      </w:tr>
+      <w:tr>
+        <w:tc>
+          <w:tcPr>
+            <w:tcW w:type="dxa" w:w="1050"/>
+          </w:tcPr>
+          <w:p>
+            <w:pPr>
+              <w:spacing w:before="0" w:after="0" w:line="259" w:lineRule="auto"/>
+              <w:jc w:val="center"/>
+            </w:pPr>
+            <w:r/>
+            <w:r>
+              <w:rPr>
+                <w:rFonts w:ascii="Calibri" w:hAnsi="Calibri"/>
+                <w:b w:val="0"/>
+                <w:color w:val="0B2545"/>
+                <w:sz w:val="18"/>
+              </w:rPr>
+              <w:t>RF-V05</w:t>
+            </w:r>
+          </w:p>
+        </w:tc>
+        <w:tc>
+          <w:tcPr>
+            <w:tcW w:type="dxa" w:w="6620"/>
+          </w:tcPr>
+          <w:p>
+            <w:pPr>
+              <w:spacing w:before="0" w:after="0" w:line="259" w:lineRule="auto"/>
+              <w:jc w:val="left"/>
+            </w:pPr>
+            <w:r/>
+            <w:r>
+              <w:rPr>
+                <w:rFonts w:ascii="Calibri" w:hAnsi="Calibri"/>
+                <w:b w:val="0"/>
+                <w:color w:val="0B2545"/>
+                <w:sz w:val="18"/>
+              </w:rPr>
+              <w:t>Normalizar, tokenizar e aplicar stemming ao texto transcrito.</w:t>
+            </w:r>
+          </w:p>
+        </w:tc>
+        <w:tc>
+          <w:tcPr>
+            <w:tcW w:type="dxa" w:w="1690"/>
+          </w:tcPr>
+          <w:p>
+            <w:pPr>
+              <w:spacing w:before="0" w:after="0" w:line="259" w:lineRule="auto"/>
+              <w:jc w:val="center"/>
+            </w:pPr>
+            <w:r/>
+            <w:r>
+              <w:rPr>
+                <w:rFonts w:ascii="Calibri" w:hAnsi="Calibri"/>
+                <w:b w:val="0"/>
+                <w:color w:val="0B2545"/>
+                <w:sz w:val="18"/>
+              </w:rPr>
+              <w:t>Obrigatória (Alta)</w:t>
+            </w:r>
+          </w:p>
+        </w:tc>
+      </w:tr>
+      <w:tr>
+        <w:tc>
+          <w:tcPr>
+            <w:tcW w:type="dxa" w:w="1050"/>
+          </w:tcPr>
+          <w:p>
+            <w:pPr>
+              <w:spacing w:before="0" w:after="0" w:line="259" w:lineRule="auto"/>
+              <w:jc w:val="center"/>
+            </w:pPr>
+            <w:r/>
+            <w:r>
+              <w:rPr>
+                <w:rFonts w:ascii="Calibri" w:hAnsi="Calibri"/>
+                <w:b w:val="0"/>
+                <w:color w:val="0B2545"/>
+                <w:sz w:val="18"/>
+              </w:rPr>
+              <w:t>RF-V06</w:t>
+            </w:r>
+          </w:p>
+        </w:tc>
+        <w:tc>
+          <w:tcPr>
+            <w:tcW w:type="dxa" w:w="6620"/>
+          </w:tcPr>
+          <w:p>
+            <w:pPr>
+              <w:spacing w:before="0" w:after="0" w:line="259" w:lineRule="auto"/>
+              <w:jc w:val="left"/>
+            </w:pPr>
+            <w:r/>
+            <w:r>
+              <w:rPr>
+                <w:rFonts w:ascii="Calibri" w:hAnsi="Calibri"/>
+                <w:b w:val="0"/>
+                <w:color w:val="0B2545"/>
+                <w:sz w:val="18"/>
+              </w:rPr>
+              <w:t>Classificar agendar, cancelar, alterar e consultar.</w:t>
+            </w:r>
+          </w:p>
+        </w:tc>
+        <w:tc>
+          <w:tcPr>
+            <w:tcW w:type="dxa" w:w="1690"/>
+          </w:tcPr>
+          <w:p>
+            <w:pPr>
+              <w:spacing w:before="0" w:after="0" w:line="259" w:lineRule="auto"/>
+              <w:jc w:val="center"/>
+            </w:pPr>
+            <w:r/>
+            <w:r>
+              <w:rPr>
+                <w:rFonts w:ascii="Calibri" w:hAnsi="Calibri"/>
+                <w:b w:val="0"/>
+                <w:color w:val="0B2545"/>
+                <w:sz w:val="18"/>
+              </w:rPr>
+              <w:t>Obrigatória (Alta)</w:t>
+            </w:r>
+          </w:p>
+        </w:tc>
+      </w:tr>
+      <w:tr>
+        <w:tc>
+          <w:tcPr>
+            <w:tcW w:type="dxa" w:w="1050"/>
+          </w:tcPr>
+          <w:p>
+            <w:pPr>
+              <w:spacing w:before="0" w:after="0" w:line="259" w:lineRule="auto"/>
+              <w:jc w:val="center"/>
+            </w:pPr>
+            <w:r/>
+            <w:r>
+              <w:rPr>
+                <w:rFonts w:ascii="Calibri" w:hAnsi="Calibri"/>
+                <w:b w:val="0"/>
+                <w:color w:val="0B2545"/>
+                <w:sz w:val="18"/>
+              </w:rPr>
+              <w:t>RF-V07</w:t>
+            </w:r>
+          </w:p>
+        </w:tc>
+        <w:tc>
+          <w:tcPr>
+            <w:tcW w:type="dxa" w:w="6620"/>
+          </w:tcPr>
+          <w:p>
+            <w:pPr>
+              <w:spacing w:before="0" w:after="0" w:line="259" w:lineRule="auto"/>
+              <w:jc w:val="left"/>
+            </w:pPr>
+            <w:r/>
+            <w:r>
+              <w:rPr>
+                <w:rFonts w:ascii="Calibri" w:hAnsi="Calibri"/>
+                <w:b w:val="0"/>
+                <w:color w:val="0B2545"/>
+                <w:sz w:val="18"/>
+              </w:rPr>
+              <w:t>Extrair serviço, data, horário e ID quando informados.</w:t>
+            </w:r>
+          </w:p>
+        </w:tc>
+        <w:tc>
+          <w:tcPr>
+            <w:tcW w:type="dxa" w:w="1690"/>
+          </w:tcPr>
+          <w:p>
+            <w:pPr>
+              <w:spacing w:before="0" w:after="0" w:line="259" w:lineRule="auto"/>
+              <w:jc w:val="center"/>
+            </w:pPr>
+            <w:r/>
+            <w:r>
+              <w:rPr>
+                <w:rFonts w:ascii="Calibri" w:hAnsi="Calibri"/>
+                <w:b w:val="0"/>
+                <w:color w:val="0B2545"/>
+                <w:sz w:val="18"/>
+              </w:rPr>
+              <w:t>Obrigatória (Alta)</w:t>
+            </w:r>
+          </w:p>
+        </w:tc>
+      </w:tr>
+      <w:tr>
+        <w:tc>
+          <w:tcPr>
+            <w:tcW w:type="dxa" w:w="1050"/>
+          </w:tcPr>
+          <w:p>
+            <w:pPr>
+              <w:spacing w:before="0" w:after="0" w:line="259" w:lineRule="auto"/>
+              <w:jc w:val="center"/>
+            </w:pPr>
+            <w:r/>
+            <w:r>
+              <w:rPr>
+                <w:rFonts w:ascii="Calibri" w:hAnsi="Calibri"/>
+                <w:b w:val="0"/>
+                <w:color w:val="0B2545"/>
+                <w:sz w:val="18"/>
+              </w:rPr>
+              <w:t>RF-V08</w:t>
+            </w:r>
+          </w:p>
+        </w:tc>
+        <w:tc>
+          <w:tcPr>
+            <w:tcW w:type="dxa" w:w="6620"/>
+          </w:tcPr>
+          <w:p>
+            <w:pPr>
+              <w:spacing w:before="0" w:after="0" w:line="259" w:lineRule="auto"/>
+              <w:jc w:val="left"/>
+            </w:pPr>
+            <w:r/>
+            <w:r>
+              <w:rPr>
+                <w:rFonts w:ascii="Calibri" w:hAnsi="Calibri"/>
+                <w:b w:val="0"/>
+                <w:color w:val="0B2545"/>
+                <w:sz w:val="18"/>
+              </w:rPr>
+              <w:t>Realizar busca semântica no catálogo de serviços.</w:t>
+            </w:r>
+          </w:p>
+        </w:tc>
+        <w:tc>
+          <w:tcPr>
+            <w:tcW w:type="dxa" w:w="1690"/>
+          </w:tcPr>
+          <w:p>
+            <w:pPr>
+              <w:spacing w:before="0" w:after="0" w:line="259" w:lineRule="auto"/>
+              <w:jc w:val="center"/>
+            </w:pPr>
+            <w:r/>
+            <w:r>
+              <w:rPr>
+                <w:rFonts w:ascii="Calibri" w:hAnsi="Calibri"/>
+                <w:b w:val="0"/>
+                <w:color w:val="0B2545"/>
+                <w:sz w:val="18"/>
+              </w:rPr>
+              <w:t>Obrigatória (Alta)</w:t>
+            </w:r>
+          </w:p>
+        </w:tc>
+      </w:tr>
+      <w:tr>
+        <w:tc>
+          <w:tcPr>
+            <w:tcW w:type="dxa" w:w="1050"/>
+          </w:tcPr>
+          <w:p>
+            <w:pPr>
+              <w:spacing w:before="0" w:after="0" w:line="259" w:lineRule="auto"/>
+              <w:jc w:val="center"/>
+            </w:pPr>
+            <w:r/>
+            <w:r>
+              <w:rPr>
+                <w:rFonts w:ascii="Calibri" w:hAnsi="Calibri"/>
+                <w:b w:val="0"/>
+                <w:color w:val="0B2545"/>
+                <w:sz w:val="18"/>
+              </w:rPr>
+              <w:t>RF-V09</w:t>
+            </w:r>
+          </w:p>
+        </w:tc>
+        <w:tc>
+          <w:tcPr>
+            <w:tcW w:type="dxa" w:w="6620"/>
+          </w:tcPr>
+          <w:p>
+            <w:pPr>
+              <w:spacing w:before="0" w:after="0" w:line="259" w:lineRule="auto"/>
+              <w:jc w:val="left"/>
+            </w:pPr>
+            <w:r/>
+            <w:r>
+              <w:rPr>
+                <w:rFonts w:ascii="Calibri" w:hAnsi="Calibri"/>
+                <w:b w:val="0"/>
+                <w:color w:val="0B2545"/>
+                <w:sz w:val="18"/>
+              </w:rPr>
+              <w:t>Exibir serviços relevantes com dados do profissional.</w:t>
+            </w:r>
+          </w:p>
+        </w:tc>
+        <w:tc>
+          <w:tcPr>
+            <w:tcW w:type="dxa" w:w="1690"/>
+          </w:tcPr>
+          <w:p>
+            <w:pPr>
+              <w:spacing w:before="0" w:after="0" w:line="259" w:lineRule="auto"/>
+              <w:jc w:val="center"/>
+            </w:pPr>
+            <w:r/>
+            <w:r>
+              <w:rPr>
+                <w:rFonts w:ascii="Calibri" w:hAnsi="Calibri"/>
+                <w:b w:val="0"/>
+                <w:color w:val="0B2545"/>
+                <w:sz w:val="18"/>
+              </w:rPr>
+              <w:t>Obrigatória (Alta)</w:t>
+            </w:r>
+          </w:p>
+        </w:tc>
+      </w:tr>
+      <w:tr>
+        <w:tc>
+          <w:tcPr>
+            <w:tcW w:type="dxa" w:w="1050"/>
+          </w:tcPr>
+          <w:p>
+            <w:pPr>
+              <w:spacing w:before="0" w:after="0" w:line="259" w:lineRule="auto"/>
+              <w:jc w:val="center"/>
+            </w:pPr>
+            <w:r/>
+            <w:r>
+              <w:rPr>
+                <w:rFonts w:ascii="Calibri" w:hAnsi="Calibri"/>
+                <w:b w:val="0"/>
+                <w:color w:val="0B2545"/>
+                <w:sz w:val="18"/>
+              </w:rPr>
+              <w:t>RF-V10</w:t>
+            </w:r>
+          </w:p>
+        </w:tc>
+        <w:tc>
+          <w:tcPr>
+            <w:tcW w:type="dxa" w:w="6620"/>
+          </w:tcPr>
+          <w:p>
+            <w:pPr>
+              <w:spacing w:before="0" w:after="0" w:line="259" w:lineRule="auto"/>
+              <w:jc w:val="left"/>
+            </w:pPr>
+            <w:r/>
+            <w:r>
+              <w:rPr>
+                <w:rFonts w:ascii="Calibri" w:hAnsi="Calibri"/>
+                <w:b w:val="0"/>
+                <w:color w:val="0B2545"/>
+                <w:sz w:val="18"/>
+              </w:rPr>
+              <w:t>Permitir texto quando a voz não puder ser usada.</w:t>
+            </w:r>
+          </w:p>
+        </w:tc>
+        <w:tc>
+          <w:tcPr>
+            <w:tcW w:type="dxa" w:w="1690"/>
+          </w:tcPr>
+          <w:p>
+            <w:pPr>
+              <w:spacing w:before="0" w:after="0" w:line="259" w:lineRule="auto"/>
+              <w:jc w:val="center"/>
+            </w:pPr>
+            <w:r/>
+            <w:r>
+              <w:rPr>
+                <w:rFonts w:ascii="Calibri" w:hAnsi="Calibri"/>
+                <w:b w:val="0"/>
+                <w:color w:val="0B2545"/>
+                <w:sz w:val="18"/>
+              </w:rPr>
+              <w:t>Obrigatória (Alta)</w:t>
+            </w:r>
+          </w:p>
+        </w:tc>
+      </w:tr>
+      <w:tr>
+        <w:tc>
+          <w:tcPr>
+            <w:tcW w:type="dxa" w:w="1050"/>
+          </w:tcPr>
+          <w:p>
+            <w:pPr>
+              <w:spacing w:before="0" w:after="0" w:line="259" w:lineRule="auto"/>
+              <w:jc w:val="center"/>
+            </w:pPr>
+            <w:r/>
+            <w:r>
+              <w:rPr>
+                <w:rFonts w:ascii="Calibri" w:hAnsi="Calibri"/>
+                <w:b w:val="0"/>
+                <w:color w:val="0B2545"/>
+                <w:sz w:val="18"/>
+              </w:rPr>
+              <w:t>RF-V11</w:t>
+            </w:r>
+          </w:p>
+        </w:tc>
+        <w:tc>
+          <w:tcPr>
+            <w:tcW w:type="dxa" w:w="6620"/>
+          </w:tcPr>
+          <w:p>
+            <w:pPr>
+              <w:spacing w:before="0" w:after="0" w:line="259" w:lineRule="auto"/>
+              <w:jc w:val="left"/>
+            </w:pPr>
+            <w:r/>
+            <w:r>
+              <w:rPr>
+                <w:rFonts w:ascii="Calibri" w:hAnsi="Calibri"/>
+                <w:b w:val="0"/>
+                <w:color w:val="0B2545"/>
+                <w:sz w:val="18"/>
+              </w:rPr>
+              <w:t>Informar falhas de permissão, áudio, transcrição ou busca.</w:t>
+            </w:r>
+          </w:p>
+        </w:tc>
+        <w:tc>
+          <w:tcPr>
+            <w:tcW w:type="dxa" w:w="1690"/>
+          </w:tcPr>
+          <w:p>
+            <w:pPr>
+              <w:spacing w:before="0" w:after="0" w:line="259" w:lineRule="auto"/>
+              <w:jc w:val="center"/>
+            </w:pPr>
+            <w:r/>
+            <w:r>
+              <w:rPr>
+                <w:rFonts w:ascii="Calibri" w:hAnsi="Calibri"/>
+                <w:b w:val="0"/>
+                <w:color w:val="0B2545"/>
+                <w:sz w:val="18"/>
+              </w:rPr>
+              <w:t>Importante (Média)</w:t>
+            </w:r>
+          </w:p>
+        </w:tc>
+      </w:tr>
+    </w:tbl>
+    <w:p>
+      <w:pPr>
+        <w:spacing w:after="40"/>
+      </w:pPr>
+    </w:p>
+    <w:p>
+      <w:pPr>
+        <w:pStyle w:val="Heading3"/>
+        <w:keepNext/>
+      </w:pPr>
+      <w:r>
+        <w:t>Requisitos não funcionais da primeira entrega</w:t>
+      </w:r>
+    </w:p>
+    <w:tbl>
+      <w:tblPr>
+        <w:tblW w:type="dxa" w:w="9360"/>
+        <w:jc w:val="left"/>
+        <w:tblLayout w:type="fixed"/>
+        <w:tblLook w:firstColumn="1" w:firstRow="1" w:lastColumn="0" w:lastRow="0" w:noHBand="0" w:noVBand="1" w:val="04A0"/>
+        <w:tblInd w:w="120" w:type="dxa"/>
+      </w:tblPr>
+      <w:tblGrid>
+        <w:gridCol w:w="1200"/>
+        <w:gridCol w:w="8160"/>
+      </w:tblGrid>
+      <w:tr>
+        <w:trPr>
+          <w:tblHeader w:val="true"/>
+        </w:trPr>
+        <w:tc>
+          <w:tcPr>
+            <w:tcW w:type="dxa" w:w="1200"/>
+            <w:vAlign w:val="center"/>
+            <w:tcMar>
+              <w:top w:w="80" w:type="dxa"/>
+              <w:start w:w="120" w:type="dxa"/>
+              <w:bottom w:w="80" w:type="dxa"/>
+              <w:end w:w="120" w:type="dxa"/>
+            </w:tcMar>
+            <w:shd w:fill="F2F4F7"/>
+          </w:tcPr>
+          <w:p>
+            <w:pPr>
+              <w:spacing w:before="0" w:after="0" w:line="259" w:lineRule="auto"/>
+              <w:jc w:val="center"/>
+            </w:pPr>
+            <w:r/>
+            <w:r>
+              <w:rPr>
+                <w:rFonts w:ascii="Calibri" w:hAnsi="Calibri"/>
+                <w:b/>
+                <w:color w:val="1F4D78"/>
+                <w:sz w:val="18"/>
+              </w:rPr>
+              <w:t>ID</w:t>
+            </w:r>
+          </w:p>
+        </w:tc>
+        <w:tc>
+          <w:tcPr>
+            <w:tcW w:type="dxa" w:w="8160"/>
+            <w:vAlign w:val="center"/>
+            <w:tcMar>
+              <w:top w:w="80" w:type="dxa"/>
+              <w:start w:w="120" w:type="dxa"/>
+              <w:bottom w:w="80" w:type="dxa"/>
+              <w:end w:w="120" w:type="dxa"/>
+            </w:tcMar>
+            <w:shd w:fill="F2F4F7"/>
+          </w:tcPr>
+          <w:p>
+            <w:pPr>
+              <w:spacing w:before="0" w:after="0" w:line="259" w:lineRule="auto"/>
+              <w:jc w:val="left"/>
+            </w:pPr>
+            <w:r/>
+            <w:r>
+              <w:rPr>
+                <w:rFonts w:ascii="Calibri" w:hAnsi="Calibri"/>
+                <w:b/>
+                <w:color w:val="1F4D78"/>
+                <w:sz w:val="18"/>
+              </w:rPr>
+              <w:t>Requisito</w:t>
+            </w:r>
+          </w:p>
+        </w:tc>
+      </w:tr>
+      <w:tr>
+        <w:tc>
+          <w:tcPr>
+            <w:tcW w:type="dxa" w:w="1200"/>
+          </w:tcPr>
+          <w:p>
+            <w:pPr>
+              <w:spacing w:before="0" w:after="0" w:line="259" w:lineRule="auto"/>
+              <w:jc w:val="center"/>
+            </w:pPr>
+            <w:r/>
+            <w:r>
+              <w:rPr>
+                <w:rFonts w:ascii="Calibri" w:hAnsi="Calibri"/>
+                <w:b w:val="0"/>
+                <w:color w:val="0B2545"/>
+                <w:sz w:val="18"/>
+              </w:rPr>
+              <w:t>RNF-V01</w:t>
+            </w:r>
+          </w:p>
+        </w:tc>
+        <w:tc>
+          <w:tcPr>
+            <w:tcW w:type="dxa" w:w="8160"/>
+          </w:tcPr>
+          <w:p>
+            <w:pPr>
+              <w:spacing w:before="0" w:after="0" w:line="259" w:lineRule="auto"/>
+              <w:jc w:val="left"/>
+            </w:pPr>
+            <w:r/>
+            <w:r>
+              <w:rPr>
+                <w:rFonts w:ascii="Calibri" w:hAnsi="Calibri"/>
+                <w:b w:val="0"/>
+                <w:color w:val="0B2545"/>
+                <w:sz w:val="18"/>
+              </w:rPr>
+              <w:t>Compatibilidade com navegador moderno, Android e iOS.</w:t>
+            </w:r>
+          </w:p>
+        </w:tc>
+      </w:tr>
+      <w:tr>
+        <w:tc>
+          <w:tcPr>
+            <w:tcW w:type="dxa" w:w="1200"/>
+          </w:tcPr>
+          <w:p>
+            <w:pPr>
+              <w:spacing w:before="0" w:after="0" w:line="259" w:lineRule="auto"/>
+              <w:jc w:val="center"/>
+            </w:pPr>
+            <w:r/>
+            <w:r>
+              <w:rPr>
+                <w:rFonts w:ascii="Calibri" w:hAnsi="Calibri"/>
+                <w:b w:val="0"/>
+                <w:color w:val="0B2545"/>
+                <w:sz w:val="18"/>
+              </w:rPr>
+              <w:t>RNF-V02</w:t>
+            </w:r>
+          </w:p>
+        </w:tc>
+        <w:tc>
+          <w:tcPr>
+            <w:tcW w:type="dxa" w:w="8160"/>
+          </w:tcPr>
+          <w:p>
+            <w:pPr>
+              <w:spacing w:before="0" w:after="0" w:line="259" w:lineRule="auto"/>
+              <w:jc w:val="left"/>
+            </w:pPr>
+            <w:r/>
+            <w:r>
+              <w:rPr>
+                <w:rFonts w:ascii="Calibri" w:hAnsi="Calibri"/>
+                <w:b w:val="0"/>
+                <w:color w:val="0B2545"/>
+                <w:sz w:val="18"/>
+              </w:rPr>
+              <w:t>Não utilizar IA generativa ou LLM.</w:t>
+            </w:r>
+          </w:p>
+        </w:tc>
+      </w:tr>
+      <w:tr>
+        <w:tc>
+          <w:tcPr>
+            <w:tcW w:type="dxa" w:w="1200"/>
+          </w:tcPr>
+          <w:p>
+            <w:pPr>
+              <w:spacing w:before="0" w:after="0" w:line="259" w:lineRule="auto"/>
+              <w:jc w:val="center"/>
+            </w:pPr>
+            <w:r/>
+            <w:r>
+              <w:rPr>
+                <w:rFonts w:ascii="Calibri" w:hAnsi="Calibri"/>
+                <w:b w:val="0"/>
+                <w:color w:val="0B2545"/>
+                <w:sz w:val="18"/>
+              </w:rPr>
+              <w:t>RNF-V03</w:t>
+            </w:r>
+          </w:p>
+        </w:tc>
+        <w:tc>
+          <w:tcPr>
+            <w:tcW w:type="dxa" w:w="8160"/>
+          </w:tcPr>
+          <w:p>
+            <w:pPr>
+              <w:spacing w:before="0" w:after="0" w:line="259" w:lineRule="auto"/>
+              <w:jc w:val="left"/>
+            </w:pPr>
+            <w:r/>
+            <w:r>
+              <w:rPr>
+                <w:rFonts w:ascii="Calibri" w:hAnsi="Calibri"/>
+                <w:b w:val="0"/>
+                <w:color w:val="0B2545"/>
+                <w:sz w:val="18"/>
+              </w:rPr>
+              <w:t>Reconhecimento de fala limitado a áudio -&gt; texto.</w:t>
+            </w:r>
+          </w:p>
+        </w:tc>
+      </w:tr>
+      <w:tr>
+        <w:tc>
+          <w:tcPr>
+            <w:tcW w:type="dxa" w:w="1200"/>
+          </w:tcPr>
+          <w:p>
+            <w:pPr>
+              <w:spacing w:before="0" w:after="0" w:line="259" w:lineRule="auto"/>
+              <w:jc w:val="center"/>
+            </w:pPr>
+            <w:r/>
+            <w:r>
+              <w:rPr>
+                <w:rFonts w:ascii="Calibri" w:hAnsi="Calibri"/>
+                <w:b w:val="0"/>
+                <w:color w:val="0B2545"/>
+                <w:sz w:val="18"/>
+              </w:rPr>
+              <w:t>RNF-V04</w:t>
+            </w:r>
+          </w:p>
+        </w:tc>
+        <w:tc>
+          <w:tcPr>
+            <w:tcW w:type="dxa" w:w="8160"/>
+          </w:tcPr>
+          <w:p>
+            <w:pPr>
+              <w:spacing w:before="0" w:after="0" w:line="259" w:lineRule="auto"/>
+              <w:jc w:val="left"/>
+            </w:pPr>
+            <w:r/>
+            <w:r>
+              <w:rPr>
+                <w:rFonts w:ascii="Calibri" w:hAnsi="Calibri"/>
+                <w:b w:val="0"/>
+                <w:color w:val="0B2545"/>
+                <w:sz w:val="18"/>
+              </w:rPr>
+              <w:t>Pipeline de PLN explicável e documentado.</w:t>
+            </w:r>
+          </w:p>
+        </w:tc>
+      </w:tr>
+      <w:tr>
+        <w:tc>
+          <w:tcPr>
+            <w:tcW w:type="dxa" w:w="1200"/>
+          </w:tcPr>
+          <w:p>
+            <w:pPr>
+              <w:spacing w:before="0" w:after="0" w:line="259" w:lineRule="auto"/>
+              <w:jc w:val="center"/>
+            </w:pPr>
+            <w:r/>
+            <w:r>
+              <w:rPr>
+                <w:rFonts w:ascii="Calibri" w:hAnsi="Calibri"/>
+                <w:b w:val="0"/>
+                <w:color w:val="0B2545"/>
+                <w:sz w:val="18"/>
+              </w:rPr>
+              <w:t>RNF-V05</w:t>
+            </w:r>
+          </w:p>
+        </w:tc>
+        <w:tc>
+          <w:tcPr>
+            <w:tcW w:type="dxa" w:w="8160"/>
+          </w:tcPr>
+          <w:p>
+            <w:pPr>
+              <w:spacing w:before="0" w:after="0" w:line="259" w:lineRule="auto"/>
+              <w:jc w:val="left"/>
+            </w:pPr>
+            <w:r/>
+            <w:r>
+              <w:rPr>
+                <w:rFonts w:ascii="Calibri" w:hAnsi="Calibri"/>
+                <w:b w:val="0"/>
+                <w:color w:val="0B2545"/>
+                <w:sz w:val="18"/>
+              </w:rPr>
+              <w:t>Chaves de API mantidas exclusivamente no backend.</w:t>
+            </w:r>
+          </w:p>
+        </w:tc>
+      </w:tr>
+      <w:tr>
+        <w:tc>
+          <w:tcPr>
+            <w:tcW w:type="dxa" w:w="1200"/>
+          </w:tcPr>
+          <w:p>
+            <w:pPr>
+              <w:spacing w:before="0" w:after="0" w:line="259" w:lineRule="auto"/>
+              <w:jc w:val="center"/>
+            </w:pPr>
+            <w:r/>
+            <w:r>
+              <w:rPr>
+                <w:rFonts w:ascii="Calibri" w:hAnsi="Calibri"/>
+                <w:b w:val="0"/>
+                <w:color w:val="0B2545"/>
+                <w:sz w:val="18"/>
+              </w:rPr>
+              <w:t>RNF-V06</w:t>
+            </w:r>
+          </w:p>
+        </w:tc>
+        <w:tc>
+          <w:tcPr>
+            <w:tcW w:type="dxa" w:w="8160"/>
+          </w:tcPr>
+          <w:p>
+            <w:pPr>
+              <w:spacing w:before="0" w:after="0" w:line="259" w:lineRule="auto"/>
+              <w:jc w:val="left"/>
+            </w:pPr>
+            <w:r/>
+            <w:r>
+              <w:rPr>
+                <w:rFonts w:ascii="Calibri" w:hAnsi="Calibri"/>
+                <w:b w:val="0"/>
+                <w:color w:val="0B2545"/>
+                <w:sz w:val="18"/>
+              </w:rPr>
+              <w:t>Áudio e transcrição não registrados em logs.</w:t>
+            </w:r>
+          </w:p>
+        </w:tc>
+      </w:tr>
+      <w:tr>
+        <w:tc>
+          <w:tcPr>
+            <w:tcW w:type="dxa" w:w="1200"/>
+          </w:tcPr>
+          <w:p>
+            <w:pPr>
+              <w:spacing w:before="0" w:after="0" w:line="259" w:lineRule="auto"/>
+              <w:jc w:val="center"/>
+            </w:pPr>
+            <w:r/>
+            <w:r>
+              <w:rPr>
+                <w:rFonts w:ascii="Calibri" w:hAnsi="Calibri"/>
+                <w:b w:val="0"/>
+                <w:color w:val="0B2545"/>
+                <w:sz w:val="18"/>
+              </w:rPr>
+              <w:t>RNF-V07</w:t>
+            </w:r>
+          </w:p>
+        </w:tc>
+        <w:tc>
+          <w:tcPr>
+            <w:tcW w:type="dxa" w:w="8160"/>
+          </w:tcPr>
+          <w:p>
+            <w:pPr>
+              <w:spacing w:before="0" w:after="0" w:line="259" w:lineRule="auto"/>
+              <w:jc w:val="left"/>
+            </w:pPr>
+            <w:r/>
+            <w:r>
+              <w:rPr>
+                <w:rFonts w:ascii="Calibri" w:hAnsi="Calibri"/>
+                <w:b w:val="0"/>
+                <w:color w:val="0B2545"/>
+                <w:sz w:val="18"/>
+              </w:rPr>
+              <w:t>Limitar formato e tamanho do áudio.</w:t>
+            </w:r>
+          </w:p>
+        </w:tc>
+      </w:tr>
+      <w:tr>
+        <w:tc>
+          <w:tcPr>
+            <w:tcW w:type="dxa" w:w="1200"/>
+          </w:tcPr>
+          <w:p>
+            <w:pPr>
+              <w:spacing w:before="0" w:after="0" w:line="259" w:lineRule="auto"/>
+              <w:jc w:val="center"/>
+            </w:pPr>
+            <w:r/>
+            <w:r>
+              <w:rPr>
+                <w:rFonts w:ascii="Calibri" w:hAnsi="Calibri"/>
+                <w:b w:val="0"/>
+                <w:color w:val="0B2545"/>
+                <w:sz w:val="18"/>
+              </w:rPr>
+              <w:t>RNF-V08</w:t>
+            </w:r>
+          </w:p>
+        </w:tc>
+        <w:tc>
+          <w:tcPr>
+            <w:tcW w:type="dxa" w:w="8160"/>
+          </w:tcPr>
+          <w:p>
+            <w:pPr>
+              <w:spacing w:before="0" w:after="0" w:line="259" w:lineRule="auto"/>
+              <w:jc w:val="left"/>
+            </w:pPr>
+            <w:r/>
+            <w:r>
+              <w:rPr>
+                <w:rFonts w:ascii="Calibri" w:hAnsi="Calibri"/>
+                <w:b w:val="0"/>
+                <w:color w:val="0B2545"/>
+                <w:sz w:val="18"/>
+              </w:rPr>
+              <w:t>Exibir feedback de gravação e processamento.</w:t>
+            </w:r>
+          </w:p>
+        </w:tc>
+      </w:tr>
+      <w:tr>
+        <w:tc>
+          <w:tcPr>
+            <w:tcW w:type="dxa" w:w="1200"/>
+          </w:tcPr>
+          <w:p>
+            <w:pPr>
+              <w:spacing w:before="0" w:after="0" w:line="259" w:lineRule="auto"/>
+              <w:jc w:val="center"/>
+            </w:pPr>
+            <w:r/>
+            <w:r>
+              <w:rPr>
+                <w:rFonts w:ascii="Calibri" w:hAnsi="Calibri"/>
+                <w:b w:val="0"/>
+                <w:color w:val="0B2545"/>
+                <w:sz w:val="18"/>
+              </w:rPr>
+              <w:t>RNF-V09</w:t>
+            </w:r>
+          </w:p>
+        </w:tc>
+        <w:tc>
+          <w:tcPr>
+            <w:tcW w:type="dxa" w:w="8160"/>
+          </w:tcPr>
+          <w:p>
+            <w:pPr>
+              <w:spacing w:before="0" w:after="0" w:line="259" w:lineRule="auto"/>
+              <w:jc w:val="left"/>
+            </w:pPr>
+            <w:r/>
+            <w:r>
+              <w:rPr>
+                <w:rFonts w:ascii="Calibri" w:hAnsi="Calibri"/>
+                <w:b w:val="0"/>
+                <w:color w:val="0B2545"/>
+                <w:sz w:val="18"/>
+              </w:rPr>
+              <w:t>Manter alternativa por texto em falhas de voz.</w:t>
+            </w:r>
+          </w:p>
+        </w:tc>
+      </w:tr>
+      <w:tr>
+        <w:tc>
+          <w:tcPr>
+            <w:tcW w:type="dxa" w:w="1200"/>
+          </w:tcPr>
+          <w:p>
+            <w:pPr>
+              <w:spacing w:before="0" w:after="0" w:line="259" w:lineRule="auto"/>
+              <w:jc w:val="center"/>
+            </w:pPr>
+            <w:r/>
+            <w:r>
+              <w:rPr>
+                <w:rFonts w:ascii="Calibri" w:hAnsi="Calibri"/>
+                <w:b w:val="0"/>
+                <w:color w:val="0B2545"/>
+                <w:sz w:val="18"/>
+              </w:rPr>
+              <w:t>RNF-V10</w:t>
+            </w:r>
+          </w:p>
+        </w:tc>
+        <w:tc>
+          <w:tcPr>
+            <w:tcW w:type="dxa" w:w="8160"/>
+          </w:tcPr>
+          <w:p>
+            <w:pPr>
+              <w:spacing w:before="0" w:after="0" w:line="259" w:lineRule="auto"/>
+              <w:jc w:val="left"/>
+            </w:pPr>
+            <w:r/>
+            <w:r>
+              <w:rPr>
+                <w:rFonts w:ascii="Calibri" w:hAnsi="Calibri"/>
+                <w:b w:val="0"/>
+                <w:color w:val="0B2545"/>
+                <w:sz w:val="18"/>
+              </w:rPr>
+              <w:t>Documentar pipeline, tecnologias e evidências de teste.</w:t>
+            </w:r>
+          </w:p>
+        </w:tc>
+      </w:tr>
+    </w:tbl>
+    <w:p>
+      <w:pPr>
+        <w:spacing w:after="40"/>
+      </w:pPr>
+    </w:p>
+    <w:p>
+      <w:pPr>
+        <w:pStyle w:val="Heading3"/>
+        <w:keepNext/>
+      </w:pPr>
+      <w:r>
+        <w:t>User stories da primeira entrega</w:t>
+      </w:r>
+    </w:p>
+    <w:tbl>
+      <w:tblPr>
+        <w:tblW w:type="dxa" w:w="9360"/>
+        <w:jc w:val="left"/>
+        <w:tblLayout w:type="fixed"/>
+        <w:tblLook w:firstColumn="1" w:firstRow="1" w:lastColumn="0" w:lastRow="0" w:noHBand="0" w:noVBand="1" w:val="04A0"/>
+        <w:tblInd w:w="120" w:type="dxa"/>
+      </w:tblPr>
+      <w:tblGrid>
+        <w:gridCol w:w="1200"/>
+        <w:gridCol w:w="8160"/>
+      </w:tblGrid>
+      <w:tr>
+        <w:trPr>
+          <w:tblHeader w:val="true"/>
+        </w:trPr>
+        <w:tc>
+          <w:tcPr>
+            <w:tcW w:type="dxa" w:w="1200"/>
+            <w:vAlign w:val="center"/>
+            <w:tcMar>
+              <w:top w:w="80" w:type="dxa"/>
+              <w:start w:w="120" w:type="dxa"/>
+              <w:bottom w:w="80" w:type="dxa"/>
+              <w:end w:w="120" w:type="dxa"/>
+            </w:tcMar>
+            <w:shd w:fill="F2F4F7"/>
+          </w:tcPr>
+          <w:p>
+            <w:pPr>
+              <w:spacing w:before="0" w:after="0" w:line="259" w:lineRule="auto"/>
+              <w:jc w:val="center"/>
+            </w:pPr>
+            <w:r/>
+            <w:r>
+              <w:rPr>
+                <w:rFonts w:ascii="Calibri" w:hAnsi="Calibri"/>
+                <w:b/>
+                <w:color w:val="1F4D78"/>
+                <w:sz w:val="18"/>
+              </w:rPr>
+              <w:t>ID</w:t>
+            </w:r>
+          </w:p>
+        </w:tc>
+        <w:tc>
+          <w:tcPr>
+            <w:tcW w:type="dxa" w:w="8160"/>
+            <w:vAlign w:val="center"/>
+            <w:tcMar>
+              <w:top w:w="80" w:type="dxa"/>
+              <w:start w:w="120" w:type="dxa"/>
+              <w:bottom w:w="80" w:type="dxa"/>
+              <w:end w:w="120" w:type="dxa"/>
+            </w:tcMar>
+            <w:shd w:fill="F2F4F7"/>
+          </w:tcPr>
+          <w:p>
+            <w:pPr>
+              <w:spacing w:before="0" w:after="0" w:line="259" w:lineRule="auto"/>
+              <w:jc w:val="left"/>
+            </w:pPr>
+            <w:r/>
+            <w:r>
+              <w:rPr>
+                <w:rFonts w:ascii="Calibri" w:hAnsi="Calibri"/>
+                <w:b/>
+                <w:color w:val="1F4D78"/>
+                <w:sz w:val="18"/>
+              </w:rPr>
+              <w:t>User story</w:t>
+            </w:r>
+          </w:p>
+        </w:tc>
+      </w:tr>
+      <w:tr>
+        <w:tc>
+          <w:tcPr>
+            <w:tcW w:type="dxa" w:w="1200"/>
+          </w:tcPr>
+          <w:p>
+            <w:pPr>
+              <w:spacing w:before="0" w:after="0" w:line="259" w:lineRule="auto"/>
+              <w:jc w:val="center"/>
+            </w:pPr>
+            <w:r/>
+            <w:r>
+              <w:rPr>
+                <w:rFonts w:ascii="Calibri" w:hAnsi="Calibri"/>
+                <w:b w:val="0"/>
+                <w:color w:val="0B2545"/>
+                <w:sz w:val="18"/>
+              </w:rPr>
+              <w:t>US-V01</w:t>
+            </w:r>
+          </w:p>
+        </w:tc>
+        <w:tc>
+          <w:tcPr>
+            <w:tcW w:type="dxa" w:w="8160"/>
+          </w:tcPr>
+          <w:p>
+            <w:pPr>
+              <w:spacing w:before="0" w:after="0" w:line="259" w:lineRule="auto"/>
+              <w:jc w:val="left"/>
+            </w:pPr>
+            <w:r/>
+            <w:r>
+              <w:rPr>
+                <w:rFonts w:ascii="Calibri" w:hAnsi="Calibri"/>
+                <w:b w:val="0"/>
+                <w:color w:val="0B2545"/>
+                <w:sz w:val="18"/>
+              </w:rPr>
+              <w:t>Como cliente, quero falar uma necessidade para buscar um serviço sem digitar.</w:t>
+            </w:r>
+          </w:p>
+        </w:tc>
+      </w:tr>
+      <w:tr>
+        <w:tc>
+          <w:tcPr>
+            <w:tcW w:type="dxa" w:w="1200"/>
+          </w:tcPr>
+          <w:p>
+            <w:pPr>
+              <w:spacing w:before="0" w:after="0" w:line="259" w:lineRule="auto"/>
+              <w:jc w:val="center"/>
+            </w:pPr>
+            <w:r/>
+            <w:r>
+              <w:rPr>
+                <w:rFonts w:ascii="Calibri" w:hAnsi="Calibri"/>
+                <w:b w:val="0"/>
+                <w:color w:val="0B2545"/>
+                <w:sz w:val="18"/>
+              </w:rPr>
+              <w:t>US-V02</w:t>
+            </w:r>
+          </w:p>
+        </w:tc>
+        <w:tc>
+          <w:tcPr>
+            <w:tcW w:type="dxa" w:w="8160"/>
+          </w:tcPr>
+          <w:p>
+            <w:pPr>
+              <w:spacing w:before="0" w:after="0" w:line="259" w:lineRule="auto"/>
+              <w:jc w:val="left"/>
+            </w:pPr>
+            <w:r/>
+            <w:r>
+              <w:rPr>
+                <w:rFonts w:ascii="Calibri" w:hAnsi="Calibri"/>
+                <w:b w:val="0"/>
+                <w:color w:val="0B2545"/>
+                <w:sz w:val="18"/>
+              </w:rPr>
+              <w:t>Como cliente, quero ver minha fala transcrita para confirmar o entendimento.</w:t>
+            </w:r>
+          </w:p>
+        </w:tc>
+      </w:tr>
+      <w:tr>
+        <w:tc>
+          <w:tcPr>
+            <w:tcW w:type="dxa" w:w="1200"/>
+          </w:tcPr>
+          <w:p>
+            <w:pPr>
+              <w:spacing w:before="0" w:after="0" w:line="259" w:lineRule="auto"/>
+              <w:jc w:val="center"/>
+            </w:pPr>
+            <w:r/>
+            <w:r>
+              <w:rPr>
+                <w:rFonts w:ascii="Calibri" w:hAnsi="Calibri"/>
+                <w:b w:val="0"/>
+                <w:color w:val="0B2545"/>
+                <w:sz w:val="18"/>
+              </w:rPr>
+              <w:t>US-V03</w:t>
+            </w:r>
+          </w:p>
+        </w:tc>
+        <w:tc>
+          <w:tcPr>
+            <w:tcW w:type="dxa" w:w="8160"/>
+          </w:tcPr>
+          <w:p>
+            <w:pPr>
+              <w:spacing w:before="0" w:after="0" w:line="259" w:lineRule="auto"/>
+              <w:jc w:val="left"/>
+            </w:pPr>
+            <w:r/>
+            <w:r>
+              <w:rPr>
+                <w:rFonts w:ascii="Calibri" w:hAnsi="Calibri"/>
+                <w:b w:val="0"/>
+                <w:color w:val="0B2545"/>
+                <w:sz w:val="18"/>
+              </w:rPr>
+              <w:t>Como cliente, quero receber serviços relevantes mesmo usando palavras diferentes do catálogo.</w:t>
+            </w:r>
+          </w:p>
+        </w:tc>
+      </w:tr>
+      <w:tr>
+        <w:tc>
+          <w:tcPr>
+            <w:tcW w:type="dxa" w:w="1200"/>
+          </w:tcPr>
+          <w:p>
+            <w:pPr>
+              <w:spacing w:before="0" w:after="0" w:line="259" w:lineRule="auto"/>
+              <w:jc w:val="center"/>
+            </w:pPr>
+            <w:r/>
+            <w:r>
+              <w:rPr>
+                <w:rFonts w:ascii="Calibri" w:hAnsi="Calibri"/>
+                <w:b w:val="0"/>
+                <w:color w:val="0B2545"/>
+                <w:sz w:val="18"/>
+              </w:rPr>
+              <w:t>US-V04</w:t>
+            </w:r>
+          </w:p>
+        </w:tc>
+        <w:tc>
+          <w:tcPr>
+            <w:tcW w:type="dxa" w:w="8160"/>
+          </w:tcPr>
+          <w:p>
+            <w:pPr>
+              <w:spacing w:before="0" w:after="0" w:line="259" w:lineRule="auto"/>
+              <w:jc w:val="left"/>
+            </w:pPr>
+            <w:r/>
+            <w:r>
+              <w:rPr>
+                <w:rFonts w:ascii="Calibri" w:hAnsi="Calibri"/>
+                <w:b w:val="0"/>
+                <w:color w:val="0B2545"/>
+                <w:sz w:val="18"/>
+              </w:rPr>
+              <w:t>Como cliente, quero digitar se o microfone estiver indisponível.</w:t>
+            </w:r>
+          </w:p>
+        </w:tc>
+      </w:tr>
+      <w:tr>
+        <w:tc>
+          <w:tcPr>
+            <w:tcW w:type="dxa" w:w="1200"/>
+          </w:tcPr>
+          <w:p>
+            <w:pPr>
+              <w:spacing w:before="0" w:after="0" w:line="259" w:lineRule="auto"/>
+              <w:jc w:val="center"/>
+            </w:pPr>
+            <w:r/>
+            <w:r>
+              <w:rPr>
+                <w:rFonts w:ascii="Calibri" w:hAnsi="Calibri"/>
+                <w:b w:val="0"/>
+                <w:color w:val="0B2545"/>
+                <w:sz w:val="18"/>
+              </w:rPr>
+              <w:t>US-V05</w:t>
+            </w:r>
+          </w:p>
+        </w:tc>
+        <w:tc>
+          <w:tcPr>
+            <w:tcW w:type="dxa" w:w="8160"/>
+          </w:tcPr>
+          <w:p>
+            <w:pPr>
+              <w:spacing w:before="0" w:after="0" w:line="259" w:lineRule="auto"/>
+              <w:jc w:val="left"/>
+            </w:pPr>
+            <w:r/>
+            <w:r>
+              <w:rPr>
+                <w:rFonts w:ascii="Calibri" w:hAnsi="Calibri"/>
+                <w:b w:val="0"/>
+                <w:color w:val="0B2545"/>
+                <w:sz w:val="18"/>
+              </w:rPr>
+              <w:t>Como avaliador, quero visualizar o pipeline de PLN para verificar que não há IA generativa.</w:t>
+            </w:r>
+          </w:p>
+        </w:tc>
+      </w:tr>
+    </w:tbl>
+    <w:p>
+      <w:pPr>
+        <w:spacing w:after="40"/>
+      </w:pPr>
+    </w:p>
+    <w:p>
+      <w:pPr>
+        <w:pStyle w:val="Heading3"/>
+        <w:keepNext/>
+      </w:pPr>
+      <w:r>
+        <w:t>Critérios de aceite da primeira entrega</w:t>
+      </w:r>
+    </w:p>
+    <w:p>
+      <w:pPr>
+        <w:ind w:left="360" w:hanging="360"/>
+      </w:pPr>
+      <w:r>
+        <w:rPr>
+          <w:rFonts w:ascii="Calibri" w:hAnsi="Calibri"/>
+          <w:b/>
+          <w:color w:val="1F4D78"/>
+          <w:sz w:val="21"/>
+        </w:rPr>
+        <w:t xml:space="preserve">CA-V01  </w:t>
+      </w:r>
+      <w:r>
+        <w:rPr>
+          <w:rFonts w:ascii="Calibri" w:hAnsi="Calibri"/>
+          <w:color w:val="0B2545"/>
+          <w:sz w:val="21"/>
+        </w:rPr>
+        <w:t>Ao falar “preciso de alguém para montar um armário”, o sistema exibe a transcrição e serviços de montagem relevantes.</w:t>
+      </w:r>
+    </w:p>
+    <w:p>
+      <w:pPr>
+        <w:ind w:left="360" w:hanging="360"/>
+      </w:pPr>
+      <w:r>
+        <w:rPr>
+          <w:rFonts w:ascii="Calibri" w:hAnsi="Calibri"/>
+          <w:b/>
+          <w:color w:val="1F4D78"/>
+          <w:sz w:val="21"/>
+        </w:rPr>
+        <w:t xml:space="preserve">CA-V02  </w:t>
+      </w:r>
+      <w:r>
+        <w:rPr>
+          <w:rFonts w:ascii="Calibri" w:hAnsi="Calibri"/>
+          <w:color w:val="0B2545"/>
+          <w:sz w:val="21"/>
+        </w:rPr>
+        <w:t>Com a permissão negada, o usuário recebe mensagem clara e consegue usar texto.</w:t>
+      </w:r>
+    </w:p>
+    <w:p>
+      <w:pPr>
+        <w:ind w:left="360" w:hanging="360"/>
+      </w:pPr>
+      <w:r>
+        <w:rPr>
+          <w:rFonts w:ascii="Calibri" w:hAnsi="Calibri"/>
+          <w:b/>
+          <w:color w:val="1F4D78"/>
+          <w:sz w:val="21"/>
+        </w:rPr>
+        <w:t xml:space="preserve">CA-V03  </w:t>
+      </w:r>
+      <w:r>
+        <w:rPr>
+          <w:rFonts w:ascii="Calibri" w:hAnsi="Calibri"/>
+          <w:color w:val="0B2545"/>
+          <w:sz w:val="21"/>
+        </w:rPr>
+        <w:t>O fluxo é demonstrável em navegador e em emulador Android.</w:t>
+      </w:r>
+    </w:p>
+    <w:p>
+      <w:pPr>
+        <w:ind w:left="360" w:hanging="360"/>
+      </w:pPr>
+      <w:r>
+        <w:rPr>
+          <w:rFonts w:ascii="Calibri" w:hAnsi="Calibri"/>
+          <w:b/>
+          <w:color w:val="1F4D78"/>
+          <w:sz w:val="21"/>
+        </w:rPr>
+        <w:t xml:space="preserve">CA-V04  </w:t>
+      </w:r>
+      <w:r>
+        <w:rPr>
+          <w:rFonts w:ascii="Calibri" w:hAnsi="Calibri"/>
+          <w:color w:val="0B2545"/>
+          <w:sz w:val="21"/>
+        </w:rPr>
+        <w:t>A documentação mostra voz, texto, etapas de PLN, intenção, entidades e busca semântica.</w:t>
+      </w:r>
+    </w:p>
+    <w:p>
+      <w:pPr>
+        <w:ind w:left="360" w:hanging="360"/>
+      </w:pPr>
+      <w:r>
+        <w:rPr>
+          <w:rFonts w:ascii="Calibri" w:hAnsi="Calibri"/>
+          <w:b/>
+          <w:color w:val="1F4D78"/>
+          <w:sz w:val="21"/>
+        </w:rPr>
+        <w:t xml:space="preserve">CA-V05  </w:t>
+      </w:r>
+      <w:r>
+        <w:rPr>
+          <w:rFonts w:ascii="Calibri" w:hAnsi="Calibri"/>
+          <w:color w:val="0B2545"/>
+          <w:sz w:val="21"/>
+        </w:rPr>
+        <w:t>Nenhuma chave de transcrição é exposta no frontend e não há uso de IA generativa.</w:t>
+      </w:r>
+    </w:p>
+    <w:tbl>
+      <w:tblPr>
+        <w:tblW w:type="dxa" w:w="9360"/>
+        <w:jc w:val="left"/>
+        <w:tblLayout w:type="fixed"/>
+        <w:tblLook w:firstColumn="1" w:firstRow="1" w:lastColumn="0" w:lastRow="0" w:noHBand="0" w:noVBand="1" w:val="04A0"/>
+        <w:tblInd w:w="120" w:type="dxa"/>
+      </w:tblPr>
+      <w:tblGrid>
+        <w:gridCol w:w="9360"/>
+      </w:tblGrid>
+      <w:tr>
+        <w:tc>
+          <w:tcPr>
+            <w:tcW w:type="dxa" w:w="9360"/>
+            <w:vAlign w:val="center"/>
+            <w:tcMar>
+              <w:top w:w="80" w:type="dxa"/>
+              <w:start w:w="120" w:type="dxa"/>
+              <w:bottom w:w="80" w:type="dxa"/>
+              <w:end w:w="120" w:type="dxa"/>
+            </w:tcMar>
+            <w:shd w:fill="F4F6F9"/>
+          </w:tcPr>
+          <w:p>
+            <w:pPr>
+              <w:spacing w:before="40" w:after="40" w:line="264" w:lineRule="auto"/>
+            </w:pPr>
+            <w:r/>
+            <w:r>
+              <w:rPr>
+                <w:rFonts w:ascii="Calibri" w:hAnsi="Calibri"/>
+                <w:b/>
+                <w:color w:val="1F4D78"/>
+                <w:sz w:val="20"/>
+              </w:rPr>
+              <w:t xml:space="preserve">Fora do escopo desta entrega: </w:t>
+            </w:r>
+            <w:r>
+              <w:rPr>
+                <w:rFonts w:ascii="Calibri" w:hAnsi="Calibri"/>
+                <w:color w:val="0B2545"/>
+                <w:sz w:val="20"/>
+              </w:rPr>
+              <w:t>concluir agendamento, cancelar no banco, alterar horário no banco, pagamento e fluxo conversacional completo.</w:t>
+            </w:r>
+          </w:p>
+        </w:tc>
+      </w:tr>
+    </w:tbl>
+    <w:p>
+      <w:pPr>
+        <w:spacing w:after="40"/>
+      </w:pPr>
+    </w:p>
+    <w:p>
+      <w:pPr>
+        <w:pStyle w:val="Heading2"/>
+        <w:keepNext/>
+      </w:pPr>
+      <w:r>
+        <w:t>12.2 Segunda entrega - Chatbot e gestão de agendamentos</w:t>
+      </w:r>
+    </w:p>
+    <w:p>
+      <w:pPr/>
+      <w:r>
+        <w:rPr>
+          <w:rFonts w:ascii="Calibri" w:hAnsi="Calibri"/>
+          <w:b/>
+          <w:color w:val="0B2545"/>
+        </w:rPr>
+        <w:t xml:space="preserve">Prazo: </w:t>
+      </w:r>
+      <w:r>
+        <w:rPr>
+          <w:rFonts w:ascii="Calibri" w:hAnsi="Calibri"/>
+          <w:color w:val="0B2545"/>
+        </w:rPr>
+        <w:t>Prazo informado: 21 de novembro. A imagem do calendário recebida mostra 12 de novembro; a equipe deve confirmar a data oficial.</w:t>
+      </w:r>
+    </w:p>
+    <w:p>
+      <w:pPr/>
+      <w:r>
+        <w:rPr>
+          <w:rFonts w:ascii="Calibri" w:hAnsi="Calibri"/>
+          <w:b/>
+          <w:color w:val="0B2545"/>
+        </w:rPr>
+        <w:t xml:space="preserve">Objetivo: </w:t>
+      </w:r>
+      <w:r>
+        <w:rPr>
+          <w:rFonts w:ascii="Calibri" w:hAnsi="Calibri"/>
+          <w:color w:val="0B2545"/>
+        </w:rPr>
+        <w:t>Evoluir o protótipo de voz para um chatbot completo que use texto ou voz para orientar agendamento, consulta, cancelamento e alteração de horário.</w:t>
+      </w:r>
+    </w:p>
+    <w:p>
+      <w:pPr/>
+      <w:r>
+        <w:rPr>
+          <w:rFonts w:ascii="Calibri" w:hAnsi="Calibri"/>
+          <w:b/>
+          <w:color w:val="0B2545"/>
+        </w:rPr>
+        <w:t xml:space="preserve">Integração: </w:t>
+      </w:r>
+      <w:r>
+        <w:rPr>
+          <w:rFonts w:ascii="Calibri" w:hAnsi="Calibri"/>
+          <w:color w:val="0B2545"/>
+        </w:rPr>
+        <w:t>A voz da primeira entrega será reutilizada como outra forma de entrada, sem duplicar o fluxo de negócio.</w:t>
+      </w:r>
+    </w:p>
+    <w:p>
+      <w:pPr>
+        <w:pStyle w:val="Heading3"/>
+        <w:keepNext/>
+      </w:pPr>
+      <w:r>
+        <w:t>Requisitos funcionais da segunda entrega</w:t>
+      </w:r>
+    </w:p>
+    <w:tbl>
+      <w:tblPr>
+        <w:tblW w:type="dxa" w:w="9360"/>
+        <w:jc w:val="left"/>
+        <w:tblLayout w:type="fixed"/>
+        <w:tblLook w:firstColumn="1" w:firstRow="1" w:lastColumn="0" w:lastRow="0" w:noHBand="0" w:noVBand="1" w:val="04A0"/>
+        <w:tblInd w:w="120" w:type="dxa"/>
+      </w:tblPr>
+      <w:tblGrid>
+        <w:gridCol w:w="1050"/>
+        <w:gridCol w:w="6620"/>
+        <w:gridCol w:w="1690"/>
+      </w:tblGrid>
+      <w:tr>
+        <w:trPr>
+          <w:tblHeader w:val="true"/>
+        </w:trPr>
+        <w:tc>
+          <w:tcPr>
+            <w:tcW w:type="dxa" w:w="1050"/>
+            <w:vAlign w:val="center"/>
+            <w:tcMar>
+              <w:top w:w="80" w:type="dxa"/>
+              <w:start w:w="120" w:type="dxa"/>
+              <w:bottom w:w="80" w:type="dxa"/>
+              <w:end w:w="120" w:type="dxa"/>
+            </w:tcMar>
+            <w:shd w:fill="F2F4F7"/>
+          </w:tcPr>
+          <w:p>
+            <w:pPr>
+              <w:spacing w:before="0" w:after="0" w:line="259" w:lineRule="auto"/>
+              <w:jc w:val="center"/>
+            </w:pPr>
+            <w:r/>
+            <w:r>
+              <w:rPr>
+                <w:rFonts w:ascii="Calibri" w:hAnsi="Calibri"/>
+                <w:b/>
+                <w:color w:val="1F4D78"/>
+                <w:sz w:val="18"/>
+              </w:rPr>
+              <w:t>ID</w:t>
+            </w:r>
+          </w:p>
+        </w:tc>
+        <w:tc>
+          <w:tcPr>
+            <w:tcW w:type="dxa" w:w="6620"/>
+            <w:vAlign w:val="center"/>
+            <w:tcMar>
+              <w:top w:w="80" w:type="dxa"/>
+              <w:start w:w="120" w:type="dxa"/>
+              <w:bottom w:w="80" w:type="dxa"/>
+              <w:end w:w="120" w:type="dxa"/>
+            </w:tcMar>
+            <w:shd w:fill="F2F4F7"/>
+          </w:tcPr>
+          <w:p>
+            <w:pPr>
+              <w:spacing w:before="0" w:after="0" w:line="259" w:lineRule="auto"/>
+              <w:jc w:val="left"/>
+            </w:pPr>
+            <w:r/>
+            <w:r>
+              <w:rPr>
+                <w:rFonts w:ascii="Calibri" w:hAnsi="Calibri"/>
+                <w:b/>
+                <w:color w:val="1F4D78"/>
+                <w:sz w:val="18"/>
+              </w:rPr>
+              <w:t>Requisito</w:t>
+            </w:r>
+          </w:p>
+        </w:tc>
+        <w:tc>
+          <w:tcPr>
+            <w:tcW w:type="dxa" w:w="1690"/>
+            <w:vAlign w:val="center"/>
+            <w:tcMar>
+              <w:top w:w="80" w:type="dxa"/>
+              <w:start w:w="120" w:type="dxa"/>
+              <w:bottom w:w="80" w:type="dxa"/>
+              <w:end w:w="120" w:type="dxa"/>
+            </w:tcMar>
+            <w:shd w:fill="F2F4F7"/>
+          </w:tcPr>
+          <w:p>
+            <w:pPr>
+              <w:spacing w:before="0" w:after="0" w:line="259" w:lineRule="auto"/>
+              <w:jc w:val="center"/>
+            </w:pPr>
+            <w:r/>
+            <w:r>
+              <w:rPr>
+                <w:rFonts w:ascii="Calibri" w:hAnsi="Calibri"/>
+                <w:b/>
+                <w:color w:val="1F4D78"/>
+                <w:sz w:val="18"/>
+              </w:rPr>
+              <w:t>Prioridade</w:t>
+            </w:r>
+          </w:p>
+        </w:tc>
+      </w:tr>
+      <w:tr>
+        <w:tc>
+          <w:tcPr>
+            <w:tcW w:type="dxa" w:w="1050"/>
+          </w:tcPr>
+          <w:p>
+            <w:pPr>
+              <w:spacing w:before="0" w:after="0" w:line="259" w:lineRule="auto"/>
+              <w:jc w:val="center"/>
+            </w:pPr>
+            <w:r/>
+            <w:r>
+              <w:rPr>
+                <w:rFonts w:ascii="Calibri" w:hAnsi="Calibri"/>
+                <w:b w:val="0"/>
+                <w:color w:val="0B2545"/>
+                <w:sz w:val="18"/>
+              </w:rPr>
+              <w:t>RF-C01</w:t>
+            </w:r>
+          </w:p>
+        </w:tc>
+        <w:tc>
+          <w:tcPr>
+            <w:tcW w:type="dxa" w:w="6620"/>
+          </w:tcPr>
+          <w:p>
+            <w:pPr>
+              <w:spacing w:before="0" w:after="0" w:line="259" w:lineRule="auto"/>
+              <w:jc w:val="left"/>
+            </w:pPr>
+            <w:r/>
+            <w:r>
+              <w:rPr>
+                <w:rFonts w:ascii="Calibri" w:hAnsi="Calibri"/>
+                <w:b w:val="0"/>
+                <w:color w:val="0B2545"/>
+                <w:sz w:val="18"/>
+              </w:rPr>
+              <w:t>Abrir o chatbot para usuário autenticado.</w:t>
+            </w:r>
+          </w:p>
+        </w:tc>
+        <w:tc>
+          <w:tcPr>
+            <w:tcW w:type="dxa" w:w="1690"/>
+          </w:tcPr>
+          <w:p>
+            <w:pPr>
+              <w:spacing w:before="0" w:after="0" w:line="259" w:lineRule="auto"/>
+              <w:jc w:val="center"/>
+            </w:pPr>
+            <w:r/>
+            <w:r>
+              <w:rPr>
+                <w:rFonts w:ascii="Calibri" w:hAnsi="Calibri"/>
+                <w:b w:val="0"/>
+                <w:color w:val="0B2545"/>
+                <w:sz w:val="18"/>
+              </w:rPr>
+              <w:t>Obrigatória (Alta)</w:t>
+            </w:r>
+          </w:p>
+        </w:tc>
+      </w:tr>
+      <w:tr>
+        <w:tc>
+          <w:tcPr>
+            <w:tcW w:type="dxa" w:w="1050"/>
+          </w:tcPr>
+          <w:p>
+            <w:pPr>
+              <w:spacing w:before="0" w:after="0" w:line="259" w:lineRule="auto"/>
+              <w:jc w:val="center"/>
+            </w:pPr>
+            <w:r/>
+            <w:r>
+              <w:rPr>
+                <w:rFonts w:ascii="Calibri" w:hAnsi="Calibri"/>
+                <w:b w:val="0"/>
+                <w:color w:val="0B2545"/>
+                <w:sz w:val="18"/>
+              </w:rPr>
+              <w:t>RF-C02</w:t>
+            </w:r>
+          </w:p>
+        </w:tc>
+        <w:tc>
+          <w:tcPr>
+            <w:tcW w:type="dxa" w:w="6620"/>
+          </w:tcPr>
+          <w:p>
+            <w:pPr>
+              <w:spacing w:before="0" w:after="0" w:line="259" w:lineRule="auto"/>
+              <w:jc w:val="left"/>
+            </w:pPr>
+            <w:r/>
+            <w:r>
+              <w:rPr>
+                <w:rFonts w:ascii="Calibri" w:hAnsi="Calibri"/>
+                <w:b w:val="0"/>
+                <w:color w:val="0B2545"/>
+                <w:sz w:val="18"/>
+              </w:rPr>
+              <w:t>Manter sessão e contexto de conversa.</w:t>
+            </w:r>
+          </w:p>
+        </w:tc>
+        <w:tc>
+          <w:tcPr>
+            <w:tcW w:type="dxa" w:w="1690"/>
+          </w:tcPr>
+          <w:p>
+            <w:pPr>
+              <w:spacing w:before="0" w:after="0" w:line="259" w:lineRule="auto"/>
+              <w:jc w:val="center"/>
+            </w:pPr>
+            <w:r/>
+            <w:r>
+              <w:rPr>
+                <w:rFonts w:ascii="Calibri" w:hAnsi="Calibri"/>
+                <w:b w:val="0"/>
+                <w:color w:val="0B2545"/>
+                <w:sz w:val="18"/>
+              </w:rPr>
+              <w:t>Obrigatória (Alta)</w:t>
+            </w:r>
+          </w:p>
+        </w:tc>
+      </w:tr>
+      <w:tr>
+        <w:tc>
+          <w:tcPr>
+            <w:tcW w:type="dxa" w:w="1050"/>
+          </w:tcPr>
+          <w:p>
+            <w:pPr>
+              <w:spacing w:before="0" w:after="0" w:line="259" w:lineRule="auto"/>
+              <w:jc w:val="center"/>
+            </w:pPr>
+            <w:r/>
+            <w:r>
+              <w:rPr>
+                <w:rFonts w:ascii="Calibri" w:hAnsi="Calibri"/>
+                <w:b w:val="0"/>
+                <w:color w:val="0B2545"/>
+                <w:sz w:val="18"/>
+              </w:rPr>
+              <w:t>RF-C03</w:t>
+            </w:r>
+          </w:p>
+        </w:tc>
+        <w:tc>
+          <w:tcPr>
+            <w:tcW w:type="dxa" w:w="6620"/>
+          </w:tcPr>
+          <w:p>
+            <w:pPr>
+              <w:spacing w:before="0" w:after="0" w:line="259" w:lineRule="auto"/>
+              <w:jc w:val="left"/>
+            </w:pPr>
+            <w:r/>
+            <w:r>
+              <w:rPr>
+                <w:rFonts w:ascii="Calibri" w:hAnsi="Calibri"/>
+                <w:b w:val="0"/>
+                <w:color w:val="0B2545"/>
+                <w:sz w:val="18"/>
+              </w:rPr>
+              <w:t>Conversar por texto.</w:t>
+            </w:r>
+          </w:p>
+        </w:tc>
+        <w:tc>
+          <w:tcPr>
+            <w:tcW w:type="dxa" w:w="1690"/>
+          </w:tcPr>
+          <w:p>
+            <w:pPr>
+              <w:spacing w:before="0" w:after="0" w:line="259" w:lineRule="auto"/>
+              <w:jc w:val="center"/>
+            </w:pPr>
+            <w:r/>
+            <w:r>
+              <w:rPr>
+                <w:rFonts w:ascii="Calibri" w:hAnsi="Calibri"/>
+                <w:b w:val="0"/>
+                <w:color w:val="0B2545"/>
+                <w:sz w:val="18"/>
+              </w:rPr>
+              <w:t>Obrigatória (Alta)</w:t>
+            </w:r>
+          </w:p>
+        </w:tc>
+      </w:tr>
+      <w:tr>
+        <w:tc>
+          <w:tcPr>
+            <w:tcW w:type="dxa" w:w="1050"/>
+          </w:tcPr>
+          <w:p>
+            <w:pPr>
+              <w:spacing w:before="0" w:after="0" w:line="259" w:lineRule="auto"/>
+              <w:jc w:val="center"/>
+            </w:pPr>
+            <w:r/>
+            <w:r>
+              <w:rPr>
+                <w:rFonts w:ascii="Calibri" w:hAnsi="Calibri"/>
+                <w:b w:val="0"/>
+                <w:color w:val="0B2545"/>
+                <w:sz w:val="18"/>
+              </w:rPr>
+              <w:t>RF-C04</w:t>
+            </w:r>
+          </w:p>
+        </w:tc>
+        <w:tc>
+          <w:tcPr>
+            <w:tcW w:type="dxa" w:w="6620"/>
+          </w:tcPr>
+          <w:p>
+            <w:pPr>
+              <w:spacing w:before="0" w:after="0" w:line="259" w:lineRule="auto"/>
+              <w:jc w:val="left"/>
+            </w:pPr>
+            <w:r/>
+            <w:r>
+              <w:rPr>
+                <w:rFonts w:ascii="Calibri" w:hAnsi="Calibri"/>
+                <w:b w:val="0"/>
+                <w:color w:val="0B2545"/>
+                <w:sz w:val="18"/>
+              </w:rPr>
+              <w:t>Aceitar os comandos de voz da primeira entrega.</w:t>
+            </w:r>
+          </w:p>
+        </w:tc>
+        <w:tc>
+          <w:tcPr>
+            <w:tcW w:type="dxa" w:w="1690"/>
+          </w:tcPr>
+          <w:p>
+            <w:pPr>
+              <w:spacing w:before="0" w:after="0" w:line="259" w:lineRule="auto"/>
+              <w:jc w:val="center"/>
+            </w:pPr>
+            <w:r/>
+            <w:r>
+              <w:rPr>
+                <w:rFonts w:ascii="Calibri" w:hAnsi="Calibri"/>
+                <w:b w:val="0"/>
+                <w:color w:val="0B2545"/>
+                <w:sz w:val="18"/>
+              </w:rPr>
+              <w:t>Obrigatória (Alta)</w:t>
+            </w:r>
+          </w:p>
+        </w:tc>
+      </w:tr>
+      <w:tr>
+        <w:tc>
+          <w:tcPr>
+            <w:tcW w:type="dxa" w:w="1050"/>
+          </w:tcPr>
+          <w:p>
+            <w:pPr>
+              <w:spacing w:before="0" w:after="0" w:line="259" w:lineRule="auto"/>
+              <w:jc w:val="center"/>
+            </w:pPr>
+            <w:r/>
+            <w:r>
+              <w:rPr>
+                <w:rFonts w:ascii="Calibri" w:hAnsi="Calibri"/>
+                <w:b w:val="0"/>
+                <w:color w:val="0B2545"/>
+                <w:sz w:val="18"/>
+              </w:rPr>
+              <w:t>RF-C05</w:t>
+            </w:r>
+          </w:p>
+        </w:tc>
+        <w:tc>
+          <w:tcPr>
+            <w:tcW w:type="dxa" w:w="6620"/>
+          </w:tcPr>
+          <w:p>
+            <w:pPr>
+              <w:spacing w:before="0" w:after="0" w:line="259" w:lineRule="auto"/>
+              <w:jc w:val="left"/>
+            </w:pPr>
+            <w:r/>
+            <w:r>
+              <w:rPr>
+                <w:rFonts w:ascii="Calibri" w:hAnsi="Calibri"/>
+                <w:b w:val="0"/>
+                <w:color w:val="0B2545"/>
+                <w:sz w:val="18"/>
+              </w:rPr>
+              <w:t>Iniciar fluxo de agendamento por texto ou voz.</w:t>
+            </w:r>
+          </w:p>
+        </w:tc>
+        <w:tc>
+          <w:tcPr>
+            <w:tcW w:type="dxa" w:w="1690"/>
+          </w:tcPr>
+          <w:p>
+            <w:pPr>
+              <w:spacing w:before="0" w:after="0" w:line="259" w:lineRule="auto"/>
+              <w:jc w:val="center"/>
+            </w:pPr>
+            <w:r/>
+            <w:r>
+              <w:rPr>
+                <w:rFonts w:ascii="Calibri" w:hAnsi="Calibri"/>
+                <w:b w:val="0"/>
+                <w:color w:val="0B2545"/>
+                <w:sz w:val="18"/>
+              </w:rPr>
+              <w:t>Obrigatória (Alta)</w:t>
+            </w:r>
+          </w:p>
+        </w:tc>
+      </w:tr>
+      <w:tr>
+        <w:tc>
+          <w:tcPr>
+            <w:tcW w:type="dxa" w:w="1050"/>
+          </w:tcPr>
+          <w:p>
+            <w:pPr>
+              <w:spacing w:before="0" w:after="0" w:line="259" w:lineRule="auto"/>
+              <w:jc w:val="center"/>
+            </w:pPr>
+            <w:r/>
+            <w:r>
+              <w:rPr>
+                <w:rFonts w:ascii="Calibri" w:hAnsi="Calibri"/>
+                <w:b w:val="0"/>
+                <w:color w:val="0B2545"/>
+                <w:sz w:val="18"/>
+              </w:rPr>
+              <w:t>RF-C06</w:t>
+            </w:r>
+          </w:p>
+        </w:tc>
+        <w:tc>
+          <w:tcPr>
+            <w:tcW w:type="dxa" w:w="6620"/>
+          </w:tcPr>
+          <w:p>
+            <w:pPr>
+              <w:spacing w:before="0" w:after="0" w:line="259" w:lineRule="auto"/>
+              <w:jc w:val="left"/>
+            </w:pPr>
+            <w:r/>
+            <w:r>
+              <w:rPr>
+                <w:rFonts w:ascii="Calibri" w:hAnsi="Calibri"/>
+                <w:b w:val="0"/>
+                <w:color w:val="0B2545"/>
+                <w:sz w:val="18"/>
+              </w:rPr>
+              <w:t>Solicitar serviço, data, horário e profissional faltantes.</w:t>
+            </w:r>
+          </w:p>
+        </w:tc>
+        <w:tc>
+          <w:tcPr>
+            <w:tcW w:type="dxa" w:w="1690"/>
+          </w:tcPr>
+          <w:p>
+            <w:pPr>
+              <w:spacing w:before="0" w:after="0" w:line="259" w:lineRule="auto"/>
+              <w:jc w:val="center"/>
+            </w:pPr>
+            <w:r/>
+            <w:r>
+              <w:rPr>
+                <w:rFonts w:ascii="Calibri" w:hAnsi="Calibri"/>
+                <w:b w:val="0"/>
+                <w:color w:val="0B2545"/>
+                <w:sz w:val="18"/>
+              </w:rPr>
+              <w:t>Obrigatória (Alta)</w:t>
+            </w:r>
+          </w:p>
+        </w:tc>
+      </w:tr>
+      <w:tr>
+        <w:tc>
+          <w:tcPr>
+            <w:tcW w:type="dxa" w:w="1050"/>
+          </w:tcPr>
+          <w:p>
+            <w:pPr>
+              <w:spacing w:before="0" w:after="0" w:line="259" w:lineRule="auto"/>
+              <w:jc w:val="center"/>
+            </w:pPr>
+            <w:r/>
+            <w:r>
+              <w:rPr>
+                <w:rFonts w:ascii="Calibri" w:hAnsi="Calibri"/>
+                <w:b w:val="0"/>
+                <w:color w:val="0B2545"/>
+                <w:sz w:val="18"/>
+              </w:rPr>
+              <w:t>RF-C07</w:t>
+            </w:r>
+          </w:p>
+        </w:tc>
+        <w:tc>
+          <w:tcPr>
+            <w:tcW w:type="dxa" w:w="6620"/>
+          </w:tcPr>
+          <w:p>
+            <w:pPr>
+              <w:spacing w:before="0" w:after="0" w:line="259" w:lineRule="auto"/>
+              <w:jc w:val="left"/>
+            </w:pPr>
+            <w:r/>
+            <w:r>
+              <w:rPr>
+                <w:rFonts w:ascii="Calibri" w:hAnsi="Calibri"/>
+                <w:b w:val="0"/>
+                <w:color w:val="0B2545"/>
+                <w:sz w:val="18"/>
+              </w:rPr>
+              <w:t>Exibir serviços, profissionais e horários disponíveis.</w:t>
+            </w:r>
+          </w:p>
+        </w:tc>
+        <w:tc>
+          <w:tcPr>
+            <w:tcW w:type="dxa" w:w="1690"/>
+          </w:tcPr>
+          <w:p>
+            <w:pPr>
+              <w:spacing w:before="0" w:after="0" w:line="259" w:lineRule="auto"/>
+              <w:jc w:val="center"/>
+            </w:pPr>
+            <w:r/>
+            <w:r>
+              <w:rPr>
+                <w:rFonts w:ascii="Calibri" w:hAnsi="Calibri"/>
+                <w:b w:val="0"/>
+                <w:color w:val="0B2545"/>
+                <w:sz w:val="18"/>
+              </w:rPr>
+              <w:t>Obrigatória (Alta)</w:t>
+            </w:r>
+          </w:p>
+        </w:tc>
+      </w:tr>
+      <w:tr>
+        <w:tc>
+          <w:tcPr>
+            <w:tcW w:type="dxa" w:w="1050"/>
+          </w:tcPr>
+          <w:p>
+            <w:pPr>
+              <w:spacing w:before="0" w:after="0" w:line="259" w:lineRule="auto"/>
+              <w:jc w:val="center"/>
+            </w:pPr>
+            <w:r/>
+            <w:r>
+              <w:rPr>
+                <w:rFonts w:ascii="Calibri" w:hAnsi="Calibri"/>
+                <w:b w:val="0"/>
+                <w:color w:val="0B2545"/>
+                <w:sz w:val="18"/>
+              </w:rPr>
+              <w:t>RF-C08</w:t>
+            </w:r>
+          </w:p>
+        </w:tc>
+        <w:tc>
+          <w:tcPr>
+            <w:tcW w:type="dxa" w:w="6620"/>
+          </w:tcPr>
+          <w:p>
+            <w:pPr>
+              <w:spacing w:before="0" w:after="0" w:line="259" w:lineRule="auto"/>
+              <w:jc w:val="left"/>
+            </w:pPr>
+            <w:r/>
+            <w:r>
+              <w:rPr>
+                <w:rFonts w:ascii="Calibri" w:hAnsi="Calibri"/>
+                <w:b w:val="0"/>
+                <w:color w:val="0B2545"/>
+                <w:sz w:val="18"/>
+              </w:rPr>
+              <w:t>Validar disponibilidade antes de confirmar agendamento.</w:t>
+            </w:r>
+          </w:p>
+        </w:tc>
+        <w:tc>
+          <w:tcPr>
+            <w:tcW w:type="dxa" w:w="1690"/>
+          </w:tcPr>
+          <w:p>
+            <w:pPr>
+              <w:spacing w:before="0" w:after="0" w:line="259" w:lineRule="auto"/>
+              <w:jc w:val="center"/>
+            </w:pPr>
+            <w:r/>
+            <w:r>
+              <w:rPr>
+                <w:rFonts w:ascii="Calibri" w:hAnsi="Calibri"/>
+                <w:b w:val="0"/>
+                <w:color w:val="0B2545"/>
+                <w:sz w:val="18"/>
+              </w:rPr>
+              <w:t>Obrigatória (Alta)</w:t>
+            </w:r>
+          </w:p>
+        </w:tc>
+      </w:tr>
+      <w:tr>
+        <w:tc>
+          <w:tcPr>
+            <w:tcW w:type="dxa" w:w="1050"/>
+          </w:tcPr>
+          <w:p>
+            <w:pPr>
+              <w:spacing w:before="0" w:after="0" w:line="259" w:lineRule="auto"/>
+              <w:jc w:val="center"/>
+            </w:pPr>
+            <w:r/>
+            <w:r>
+              <w:rPr>
+                <w:rFonts w:ascii="Calibri" w:hAnsi="Calibri"/>
+                <w:b w:val="0"/>
+                <w:color w:val="0B2545"/>
+                <w:sz w:val="18"/>
+              </w:rPr>
+              <w:t>RF-C09</w:t>
+            </w:r>
+          </w:p>
+        </w:tc>
+        <w:tc>
+          <w:tcPr>
+            <w:tcW w:type="dxa" w:w="6620"/>
+          </w:tcPr>
+          <w:p>
+            <w:pPr>
+              <w:spacing w:before="0" w:after="0" w:line="259" w:lineRule="auto"/>
+              <w:jc w:val="left"/>
+            </w:pPr>
+            <w:r/>
+            <w:r>
+              <w:rPr>
+                <w:rFonts w:ascii="Calibri" w:hAnsi="Calibri"/>
+                <w:b w:val="0"/>
+                <w:color w:val="0B2545"/>
+                <w:sz w:val="18"/>
+              </w:rPr>
+              <w:t>Consultar agendamentos do usuário.</w:t>
+            </w:r>
+          </w:p>
+        </w:tc>
+        <w:tc>
+          <w:tcPr>
+            <w:tcW w:type="dxa" w:w="1690"/>
+          </w:tcPr>
+          <w:p>
+            <w:pPr>
+              <w:spacing w:before="0" w:after="0" w:line="259" w:lineRule="auto"/>
+              <w:jc w:val="center"/>
+            </w:pPr>
+            <w:r/>
+            <w:r>
+              <w:rPr>
+                <w:rFonts w:ascii="Calibri" w:hAnsi="Calibri"/>
+                <w:b w:val="0"/>
+                <w:color w:val="0B2545"/>
+                <w:sz w:val="18"/>
+              </w:rPr>
+              <w:t>Obrigatória (Alta)</w:t>
+            </w:r>
+          </w:p>
+        </w:tc>
+      </w:tr>
+      <w:tr>
+        <w:tc>
+          <w:tcPr>
+            <w:tcW w:type="dxa" w:w="1050"/>
+          </w:tcPr>
+          <w:p>
+            <w:pPr>
+              <w:spacing w:before="0" w:after="0" w:line="259" w:lineRule="auto"/>
+              <w:jc w:val="center"/>
+            </w:pPr>
+            <w:r/>
+            <w:r>
+              <w:rPr>
+                <w:rFonts w:ascii="Calibri" w:hAnsi="Calibri"/>
+                <w:b w:val="0"/>
+                <w:color w:val="0B2545"/>
+                <w:sz w:val="18"/>
+              </w:rPr>
+              <w:t>RF-C10</w:t>
+            </w:r>
+          </w:p>
+        </w:tc>
+        <w:tc>
+          <w:tcPr>
+            <w:tcW w:type="dxa" w:w="6620"/>
+          </w:tcPr>
+          <w:p>
+            <w:pPr>
+              <w:spacing w:before="0" w:after="0" w:line="259" w:lineRule="auto"/>
+              <w:jc w:val="left"/>
+            </w:pPr>
+            <w:r/>
+            <w:r>
+              <w:rPr>
+                <w:rFonts w:ascii="Calibri" w:hAnsi="Calibri"/>
+                <w:b w:val="0"/>
+                <w:color w:val="0B2545"/>
+                <w:sz w:val="18"/>
+              </w:rPr>
+              <w:t>Solicitar cancelamento de agendamento.</w:t>
+            </w:r>
+          </w:p>
+        </w:tc>
+        <w:tc>
+          <w:tcPr>
+            <w:tcW w:type="dxa" w:w="1690"/>
+          </w:tcPr>
+          <w:p>
+            <w:pPr>
+              <w:spacing w:before="0" w:after="0" w:line="259" w:lineRule="auto"/>
+              <w:jc w:val="center"/>
+            </w:pPr>
+            <w:r/>
+            <w:r>
+              <w:rPr>
+                <w:rFonts w:ascii="Calibri" w:hAnsi="Calibri"/>
+                <w:b w:val="0"/>
+                <w:color w:val="0B2545"/>
+                <w:sz w:val="18"/>
+              </w:rPr>
+              <w:t>Obrigatória (Alta)</w:t>
+            </w:r>
+          </w:p>
+        </w:tc>
+      </w:tr>
+      <w:tr>
+        <w:tc>
+          <w:tcPr>
+            <w:tcW w:type="dxa" w:w="1050"/>
+          </w:tcPr>
+          <w:p>
+            <w:pPr>
+              <w:spacing w:before="0" w:after="0" w:line="259" w:lineRule="auto"/>
+              <w:jc w:val="center"/>
+            </w:pPr>
+            <w:r/>
+            <w:r>
+              <w:rPr>
+                <w:rFonts w:ascii="Calibri" w:hAnsi="Calibri"/>
+                <w:b w:val="0"/>
+                <w:color w:val="0B2545"/>
+                <w:sz w:val="18"/>
+              </w:rPr>
+              <w:t>RF-C11</w:t>
+            </w:r>
+          </w:p>
+        </w:tc>
+        <w:tc>
+          <w:tcPr>
+            <w:tcW w:type="dxa" w:w="6620"/>
+          </w:tcPr>
+          <w:p>
+            <w:pPr>
+              <w:spacing w:before="0" w:after="0" w:line="259" w:lineRule="auto"/>
+              <w:jc w:val="left"/>
+            </w:pPr>
+            <w:r/>
+            <w:r>
+              <w:rPr>
+                <w:rFonts w:ascii="Calibri" w:hAnsi="Calibri"/>
+                <w:b w:val="0"/>
+                <w:color w:val="0B2545"/>
+                <w:sz w:val="18"/>
+              </w:rPr>
+              <w:t>Solicitar confirmação antes de cancelar.</w:t>
+            </w:r>
+          </w:p>
+        </w:tc>
+        <w:tc>
+          <w:tcPr>
+            <w:tcW w:type="dxa" w:w="1690"/>
+          </w:tcPr>
+          <w:p>
+            <w:pPr>
+              <w:spacing w:before="0" w:after="0" w:line="259" w:lineRule="auto"/>
+              <w:jc w:val="center"/>
+            </w:pPr>
+            <w:r/>
+            <w:r>
+              <w:rPr>
+                <w:rFonts w:ascii="Calibri" w:hAnsi="Calibri"/>
+                <w:b w:val="0"/>
+                <w:color w:val="0B2545"/>
+                <w:sz w:val="18"/>
+              </w:rPr>
+              <w:t>Obrigatória (Alta)</w:t>
+            </w:r>
+          </w:p>
+        </w:tc>
+      </w:tr>
+      <w:tr>
+        <w:tc>
+          <w:tcPr>
+            <w:tcW w:type="dxa" w:w="1050"/>
+          </w:tcPr>
+          <w:p>
+            <w:pPr>
+              <w:spacing w:before="0" w:after="0" w:line="259" w:lineRule="auto"/>
+              <w:jc w:val="center"/>
+            </w:pPr>
+            <w:r/>
+            <w:r>
+              <w:rPr>
+                <w:rFonts w:ascii="Calibri" w:hAnsi="Calibri"/>
+                <w:b w:val="0"/>
+                <w:color w:val="0B2545"/>
+                <w:sz w:val="18"/>
+              </w:rPr>
+              <w:t>RF-C12</w:t>
+            </w:r>
+          </w:p>
+        </w:tc>
+        <w:tc>
+          <w:tcPr>
+            <w:tcW w:type="dxa" w:w="6620"/>
+          </w:tcPr>
+          <w:p>
+            <w:pPr>
+              <w:spacing w:before="0" w:after="0" w:line="259" w:lineRule="auto"/>
+              <w:jc w:val="left"/>
+            </w:pPr>
+            <w:r/>
+            <w:r>
+              <w:rPr>
+                <w:rFonts w:ascii="Calibri" w:hAnsi="Calibri"/>
+                <w:b w:val="0"/>
+                <w:color w:val="0B2545"/>
+                <w:sz w:val="18"/>
+              </w:rPr>
+              <w:t>Solicitar alteração de data ou horário.</w:t>
+            </w:r>
+          </w:p>
+        </w:tc>
+        <w:tc>
+          <w:tcPr>
+            <w:tcW w:type="dxa" w:w="1690"/>
+          </w:tcPr>
+          <w:p>
+            <w:pPr>
+              <w:spacing w:before="0" w:after="0" w:line="259" w:lineRule="auto"/>
+              <w:jc w:val="center"/>
+            </w:pPr>
+            <w:r/>
+            <w:r>
+              <w:rPr>
+                <w:rFonts w:ascii="Calibri" w:hAnsi="Calibri"/>
+                <w:b w:val="0"/>
+                <w:color w:val="0B2545"/>
+                <w:sz w:val="18"/>
+              </w:rPr>
+              <w:t>Obrigatória (Alta)</w:t>
+            </w:r>
+          </w:p>
+        </w:tc>
+      </w:tr>
+      <w:tr>
+        <w:tc>
+          <w:tcPr>
+            <w:tcW w:type="dxa" w:w="1050"/>
+          </w:tcPr>
+          <w:p>
+            <w:pPr>
+              <w:spacing w:before="0" w:after="0" w:line="259" w:lineRule="auto"/>
+              <w:jc w:val="center"/>
+            </w:pPr>
+            <w:r/>
+            <w:r>
+              <w:rPr>
+                <w:rFonts w:ascii="Calibri" w:hAnsi="Calibri"/>
+                <w:b w:val="0"/>
+                <w:color w:val="0B2545"/>
+                <w:sz w:val="18"/>
+              </w:rPr>
+              <w:t>RF-C13</w:t>
+            </w:r>
+          </w:p>
+        </w:tc>
+        <w:tc>
+          <w:tcPr>
+            <w:tcW w:type="dxa" w:w="6620"/>
+          </w:tcPr>
+          <w:p>
+            <w:pPr>
+              <w:spacing w:before="0" w:after="0" w:line="259" w:lineRule="auto"/>
+              <w:jc w:val="left"/>
+            </w:pPr>
+            <w:r/>
+            <w:r>
+              <w:rPr>
+                <w:rFonts w:ascii="Calibri" w:hAnsi="Calibri"/>
+                <w:b w:val="0"/>
+                <w:color w:val="0B2545"/>
+                <w:sz w:val="18"/>
+              </w:rPr>
+              <w:t>Solicitar confirmação antes de alterar.</w:t>
+            </w:r>
+          </w:p>
+        </w:tc>
+        <w:tc>
+          <w:tcPr>
+            <w:tcW w:type="dxa" w:w="1690"/>
+          </w:tcPr>
+          <w:p>
+            <w:pPr>
+              <w:spacing w:before="0" w:after="0" w:line="259" w:lineRule="auto"/>
+              <w:jc w:val="center"/>
+            </w:pPr>
+            <w:r/>
+            <w:r>
+              <w:rPr>
+                <w:rFonts w:ascii="Calibri" w:hAnsi="Calibri"/>
+                <w:b w:val="0"/>
+                <w:color w:val="0B2545"/>
+                <w:sz w:val="18"/>
+              </w:rPr>
+              <w:t>Obrigatória (Alta)</w:t>
+            </w:r>
+          </w:p>
+        </w:tc>
+      </w:tr>
+      <w:tr>
+        <w:tc>
+          <w:tcPr>
+            <w:tcW w:type="dxa" w:w="1050"/>
+          </w:tcPr>
+          <w:p>
+            <w:pPr>
+              <w:spacing w:before="0" w:after="0" w:line="259" w:lineRule="auto"/>
+              <w:jc w:val="center"/>
+            </w:pPr>
+            <w:r/>
+            <w:r>
+              <w:rPr>
+                <w:rFonts w:ascii="Calibri" w:hAnsi="Calibri"/>
+                <w:b w:val="0"/>
+                <w:color w:val="0B2545"/>
+                <w:sz w:val="18"/>
+              </w:rPr>
+              <w:t>RF-C14</w:t>
+            </w:r>
+          </w:p>
+        </w:tc>
+        <w:tc>
+          <w:tcPr>
+            <w:tcW w:type="dxa" w:w="6620"/>
+          </w:tcPr>
+          <w:p>
+            <w:pPr>
+              <w:spacing w:before="0" w:after="0" w:line="259" w:lineRule="auto"/>
+              <w:jc w:val="left"/>
+            </w:pPr>
+            <w:r/>
+            <w:r>
+              <w:rPr>
+                <w:rFonts w:ascii="Calibri" w:hAnsi="Calibri"/>
+                <w:b w:val="0"/>
+                <w:color w:val="0B2545"/>
+                <w:sz w:val="18"/>
+              </w:rPr>
+              <w:t>Exibir erros, orientações e alternativa por texto.</w:t>
+            </w:r>
+          </w:p>
+        </w:tc>
+        <w:tc>
+          <w:tcPr>
+            <w:tcW w:type="dxa" w:w="1690"/>
+          </w:tcPr>
+          <w:p>
+            <w:pPr>
+              <w:spacing w:before="0" w:after="0" w:line="259" w:lineRule="auto"/>
+              <w:jc w:val="center"/>
+            </w:pPr>
+            <w:r/>
+            <w:r>
+              <w:rPr>
+                <w:rFonts w:ascii="Calibri" w:hAnsi="Calibri"/>
+                <w:b w:val="0"/>
+                <w:color w:val="0B2545"/>
+                <w:sz w:val="18"/>
+              </w:rPr>
+              <w:t>Obrigatória (Alta)</w:t>
+            </w:r>
+          </w:p>
+        </w:tc>
+      </w:tr>
+      <w:tr>
+        <w:tc>
+          <w:tcPr>
+            <w:tcW w:type="dxa" w:w="1050"/>
+          </w:tcPr>
+          <w:p>
+            <w:pPr>
+              <w:spacing w:before="0" w:after="0" w:line="259" w:lineRule="auto"/>
+              <w:jc w:val="center"/>
+            </w:pPr>
+            <w:r/>
+            <w:r>
+              <w:rPr>
+                <w:rFonts w:ascii="Calibri" w:hAnsi="Calibri"/>
+                <w:b w:val="0"/>
+                <w:color w:val="0B2545"/>
+                <w:sz w:val="18"/>
+              </w:rPr>
+              <w:t>RF-C15</w:t>
+            </w:r>
+          </w:p>
+        </w:tc>
+        <w:tc>
+          <w:tcPr>
+            <w:tcW w:type="dxa" w:w="6620"/>
+          </w:tcPr>
+          <w:p>
+            <w:pPr>
+              <w:spacing w:before="0" w:after="0" w:line="259" w:lineRule="auto"/>
+              <w:jc w:val="left"/>
+            </w:pPr>
+            <w:r/>
+            <w:r>
+              <w:rPr>
+                <w:rFonts w:ascii="Calibri" w:hAnsi="Calibri"/>
+                <w:b w:val="0"/>
+                <w:color w:val="0B2545"/>
+                <w:sz w:val="18"/>
+              </w:rPr>
+              <w:t>Reenviar voz com segurança, sem duplicar ações.</w:t>
+            </w:r>
+          </w:p>
+        </w:tc>
+        <w:tc>
+          <w:tcPr>
+            <w:tcW w:type="dxa" w:w="1690"/>
+          </w:tcPr>
+          <w:p>
+            <w:pPr>
+              <w:spacing w:before="0" w:after="0" w:line="259" w:lineRule="auto"/>
+              <w:jc w:val="center"/>
+            </w:pPr>
+            <w:r/>
+            <w:r>
+              <w:rPr>
+                <w:rFonts w:ascii="Calibri" w:hAnsi="Calibri"/>
+                <w:b w:val="0"/>
+                <w:color w:val="0B2545"/>
+                <w:sz w:val="18"/>
+              </w:rPr>
+              <w:t>Importante (Média)</w:t>
+            </w:r>
+          </w:p>
+        </w:tc>
+      </w:tr>
+    </w:tbl>
+    <w:p>
+      <w:pPr>
+        <w:spacing w:after="40"/>
+      </w:pPr>
+    </w:p>
+    <w:p>
+      <w:pPr>
+        <w:pStyle w:val="Heading3"/>
+        <w:keepNext/>
+      </w:pPr>
+      <w:r>
+        <w:t>Requisitos não funcionais da segunda entrega</w:t>
+      </w:r>
+    </w:p>
+    <w:tbl>
+      <w:tblPr>
+        <w:tblW w:type="dxa" w:w="9360"/>
+        <w:jc w:val="left"/>
+        <w:tblLayout w:type="fixed"/>
+        <w:tblLook w:firstColumn="1" w:firstRow="1" w:lastColumn="0" w:lastRow="0" w:noHBand="0" w:noVBand="1" w:val="04A0"/>
+        <w:tblInd w:w="120" w:type="dxa"/>
+      </w:tblPr>
+      <w:tblGrid>
+        <w:gridCol w:w="1200"/>
+        <w:gridCol w:w="8160"/>
+      </w:tblGrid>
+      <w:tr>
+        <w:trPr>
+          <w:tblHeader w:val="true"/>
+        </w:trPr>
+        <w:tc>
+          <w:tcPr>
+            <w:tcW w:type="dxa" w:w="1200"/>
+            <w:vAlign w:val="center"/>
+            <w:tcMar>
+              <w:top w:w="80" w:type="dxa"/>
+              <w:start w:w="120" w:type="dxa"/>
+              <w:bottom w:w="80" w:type="dxa"/>
+              <w:end w:w="120" w:type="dxa"/>
+            </w:tcMar>
+            <w:shd w:fill="F2F4F7"/>
+          </w:tcPr>
+          <w:p>
+            <w:pPr>
+              <w:spacing w:before="0" w:after="0" w:line="259" w:lineRule="auto"/>
+              <w:jc w:val="center"/>
+            </w:pPr>
+            <w:r/>
+            <w:r>
+              <w:rPr>
+                <w:rFonts w:ascii="Calibri" w:hAnsi="Calibri"/>
+                <w:b/>
+                <w:color w:val="1F4D78"/>
+                <w:sz w:val="18"/>
+              </w:rPr>
+              <w:t>ID</w:t>
+            </w:r>
+          </w:p>
+        </w:tc>
+        <w:tc>
+          <w:tcPr>
+            <w:tcW w:type="dxa" w:w="8160"/>
+            <w:vAlign w:val="center"/>
+            <w:tcMar>
+              <w:top w:w="80" w:type="dxa"/>
+              <w:start w:w="120" w:type="dxa"/>
+              <w:bottom w:w="80" w:type="dxa"/>
+              <w:end w:w="120" w:type="dxa"/>
+            </w:tcMar>
+            <w:shd w:fill="F2F4F7"/>
+          </w:tcPr>
+          <w:p>
+            <w:pPr>
+              <w:spacing w:before="0" w:after="0" w:line="259" w:lineRule="auto"/>
+              <w:jc w:val="left"/>
+            </w:pPr>
+            <w:r/>
+            <w:r>
+              <w:rPr>
+                <w:rFonts w:ascii="Calibri" w:hAnsi="Calibri"/>
+                <w:b/>
+                <w:color w:val="1F4D78"/>
+                <w:sz w:val="18"/>
+              </w:rPr>
+              <w:t>Requisito</w:t>
+            </w:r>
+          </w:p>
+        </w:tc>
+      </w:tr>
+      <w:tr>
+        <w:tc>
+          <w:tcPr>
+            <w:tcW w:type="dxa" w:w="1200"/>
+          </w:tcPr>
+          <w:p>
+            <w:pPr>
+              <w:spacing w:before="0" w:after="0" w:line="259" w:lineRule="auto"/>
+              <w:jc w:val="center"/>
+            </w:pPr>
+            <w:r/>
+            <w:r>
+              <w:rPr>
+                <w:rFonts w:ascii="Calibri" w:hAnsi="Calibri"/>
+                <w:b w:val="0"/>
+                <w:color w:val="0B2545"/>
+                <w:sz w:val="18"/>
+              </w:rPr>
+              <w:t>RNF-C01</w:t>
+            </w:r>
+          </w:p>
+        </w:tc>
+        <w:tc>
+          <w:tcPr>
+            <w:tcW w:type="dxa" w:w="8160"/>
+          </w:tcPr>
+          <w:p>
+            <w:pPr>
+              <w:spacing w:before="0" w:after="0" w:line="259" w:lineRule="auto"/>
+              <w:jc w:val="left"/>
+            </w:pPr>
+            <w:r/>
+            <w:r>
+              <w:rPr>
+                <w:rFonts w:ascii="Calibri" w:hAnsi="Calibri"/>
+                <w:b w:val="0"/>
+                <w:color w:val="0B2545"/>
+                <w:sz w:val="18"/>
+              </w:rPr>
+              <w:t>Backend como fonte de verdade para agenda, disponibilidade e permissões.</w:t>
+            </w:r>
+          </w:p>
+        </w:tc>
+      </w:tr>
+      <w:tr>
+        <w:tc>
+          <w:tcPr>
+            <w:tcW w:type="dxa" w:w="1200"/>
+          </w:tcPr>
+          <w:p>
+            <w:pPr>
+              <w:spacing w:before="0" w:after="0" w:line="259" w:lineRule="auto"/>
+              <w:jc w:val="center"/>
+            </w:pPr>
+            <w:r/>
+            <w:r>
+              <w:rPr>
+                <w:rFonts w:ascii="Calibri" w:hAnsi="Calibri"/>
+                <w:b w:val="0"/>
+                <w:color w:val="0B2545"/>
+                <w:sz w:val="18"/>
+              </w:rPr>
+              <w:t>RNF-C02</w:t>
+            </w:r>
+          </w:p>
+        </w:tc>
+        <w:tc>
+          <w:tcPr>
+            <w:tcW w:type="dxa" w:w="8160"/>
+          </w:tcPr>
+          <w:p>
+            <w:pPr>
+              <w:spacing w:before="0" w:after="0" w:line="259" w:lineRule="auto"/>
+              <w:jc w:val="left"/>
+            </w:pPr>
+            <w:r/>
+            <w:r>
+              <w:rPr>
+                <w:rFonts w:ascii="Calibri" w:hAnsi="Calibri"/>
+                <w:b w:val="0"/>
+                <w:color w:val="0B2545"/>
+                <w:sz w:val="18"/>
+              </w:rPr>
+              <w:t>Usuário consulta ou modifica somente os próprios agendamentos.</w:t>
+            </w:r>
+          </w:p>
+        </w:tc>
+      </w:tr>
+      <w:tr>
+        <w:tc>
+          <w:tcPr>
+            <w:tcW w:type="dxa" w:w="1200"/>
+          </w:tcPr>
+          <w:p>
+            <w:pPr>
+              <w:spacing w:before="0" w:after="0" w:line="259" w:lineRule="auto"/>
+              <w:jc w:val="center"/>
+            </w:pPr>
+            <w:r/>
+            <w:r>
+              <w:rPr>
+                <w:rFonts w:ascii="Calibri" w:hAnsi="Calibri"/>
+                <w:b w:val="0"/>
+                <w:color w:val="0B2545"/>
+                <w:sz w:val="18"/>
+              </w:rPr>
+              <w:t>RNF-C03</w:t>
+            </w:r>
+          </w:p>
+        </w:tc>
+        <w:tc>
+          <w:tcPr>
+            <w:tcW w:type="dxa" w:w="8160"/>
+          </w:tcPr>
+          <w:p>
+            <w:pPr>
+              <w:spacing w:before="0" w:after="0" w:line="259" w:lineRule="auto"/>
+              <w:jc w:val="left"/>
+            </w:pPr>
+            <w:r/>
+            <w:r>
+              <w:rPr>
+                <w:rFonts w:ascii="Calibri" w:hAnsi="Calibri"/>
+                <w:b w:val="0"/>
+                <w:color w:val="0B2545"/>
+                <w:sz w:val="18"/>
+              </w:rPr>
+              <w:t>Cancelamentos e alterações exigem confirmação explícita.</w:t>
+            </w:r>
+          </w:p>
+        </w:tc>
+      </w:tr>
+      <w:tr>
+        <w:tc>
+          <w:tcPr>
+            <w:tcW w:type="dxa" w:w="1200"/>
+          </w:tcPr>
+          <w:p>
+            <w:pPr>
+              <w:spacing w:before="0" w:after="0" w:line="259" w:lineRule="auto"/>
+              <w:jc w:val="center"/>
+            </w:pPr>
+            <w:r/>
+            <w:r>
+              <w:rPr>
+                <w:rFonts w:ascii="Calibri" w:hAnsi="Calibri"/>
+                <w:b w:val="0"/>
+                <w:color w:val="0B2545"/>
+                <w:sz w:val="18"/>
+              </w:rPr>
+              <w:t>RNF-C04</w:t>
+            </w:r>
+          </w:p>
+        </w:tc>
+        <w:tc>
+          <w:tcPr>
+            <w:tcW w:type="dxa" w:w="8160"/>
+          </w:tcPr>
+          <w:p>
+            <w:pPr>
+              <w:spacing w:before="0" w:after="0" w:line="259" w:lineRule="auto"/>
+              <w:jc w:val="left"/>
+            </w:pPr>
+            <w:r/>
+            <w:r>
+              <w:rPr>
+                <w:rFonts w:ascii="Calibri" w:hAnsi="Calibri"/>
+                <w:b w:val="0"/>
+                <w:color w:val="0B2545"/>
+                <w:sz w:val="18"/>
+              </w:rPr>
+              <w:t>Reenvios não podem gerar ações duplicadas.</w:t>
+            </w:r>
+          </w:p>
+        </w:tc>
+      </w:tr>
+      <w:tr>
+        <w:tc>
+          <w:tcPr>
+            <w:tcW w:type="dxa" w:w="1200"/>
+          </w:tcPr>
+          <w:p>
+            <w:pPr>
+              <w:spacing w:before="0" w:after="0" w:line="259" w:lineRule="auto"/>
+              <w:jc w:val="center"/>
+            </w:pPr>
+            <w:r/>
+            <w:r>
+              <w:rPr>
+                <w:rFonts w:ascii="Calibri" w:hAnsi="Calibri"/>
+                <w:b w:val="0"/>
+                <w:color w:val="0B2545"/>
+                <w:sz w:val="18"/>
+              </w:rPr>
+              <w:t>RNF-C05</w:t>
+            </w:r>
+          </w:p>
+        </w:tc>
+        <w:tc>
+          <w:tcPr>
+            <w:tcW w:type="dxa" w:w="8160"/>
+          </w:tcPr>
+          <w:p>
+            <w:pPr>
+              <w:spacing w:before="0" w:after="0" w:line="259" w:lineRule="auto"/>
+              <w:jc w:val="left"/>
+            </w:pPr>
+            <w:r/>
+            <w:r>
+              <w:rPr>
+                <w:rFonts w:ascii="Calibri" w:hAnsi="Calibri"/>
+                <w:b w:val="0"/>
+                <w:color w:val="0B2545"/>
+                <w:sz w:val="18"/>
+              </w:rPr>
+              <w:t>Rotas autenticadas, validadas e protegidas por rate limit.</w:t>
+            </w:r>
+          </w:p>
+        </w:tc>
+      </w:tr>
+      <w:tr>
+        <w:tc>
+          <w:tcPr>
+            <w:tcW w:type="dxa" w:w="1200"/>
+          </w:tcPr>
+          <w:p>
+            <w:pPr>
+              <w:spacing w:before="0" w:after="0" w:line="259" w:lineRule="auto"/>
+              <w:jc w:val="center"/>
+            </w:pPr>
+            <w:r/>
+            <w:r>
+              <w:rPr>
+                <w:rFonts w:ascii="Calibri" w:hAnsi="Calibri"/>
+                <w:b w:val="0"/>
+                <w:color w:val="0B2545"/>
+                <w:sz w:val="18"/>
+              </w:rPr>
+              <w:t>RNF-C06</w:t>
+            </w:r>
+          </w:p>
+        </w:tc>
+        <w:tc>
+          <w:tcPr>
+            <w:tcW w:type="dxa" w:w="8160"/>
+          </w:tcPr>
+          <w:p>
+            <w:pPr>
+              <w:spacing w:before="0" w:after="0" w:line="259" w:lineRule="auto"/>
+              <w:jc w:val="left"/>
+            </w:pPr>
+            <w:r/>
+            <w:r>
+              <w:rPr>
+                <w:rFonts w:ascii="Calibri" w:hAnsi="Calibri"/>
+                <w:b w:val="0"/>
+                <w:color w:val="0B2545"/>
+                <w:sz w:val="18"/>
+              </w:rPr>
+              <w:t>Interface acessível com feedback de carregamento, erro e gravação.</w:t>
+            </w:r>
+          </w:p>
+        </w:tc>
+      </w:tr>
+      <w:tr>
+        <w:tc>
+          <w:tcPr>
+            <w:tcW w:type="dxa" w:w="1200"/>
+          </w:tcPr>
+          <w:p>
+            <w:pPr>
+              <w:spacing w:before="0" w:after="0" w:line="259" w:lineRule="auto"/>
+              <w:jc w:val="center"/>
+            </w:pPr>
+            <w:r/>
+            <w:r>
+              <w:rPr>
+                <w:rFonts w:ascii="Calibri" w:hAnsi="Calibri"/>
+                <w:b w:val="0"/>
+                <w:color w:val="0B2545"/>
+                <w:sz w:val="18"/>
+              </w:rPr>
+              <w:t>RNF-C07</w:t>
+            </w:r>
+          </w:p>
+        </w:tc>
+        <w:tc>
+          <w:tcPr>
+            <w:tcW w:type="dxa" w:w="8160"/>
+          </w:tcPr>
+          <w:p>
+            <w:pPr>
+              <w:spacing w:before="0" w:after="0" w:line="259" w:lineRule="auto"/>
+              <w:jc w:val="left"/>
+            </w:pPr>
+            <w:r/>
+            <w:r>
+              <w:rPr>
+                <w:rFonts w:ascii="Calibri" w:hAnsi="Calibri"/>
+                <w:b w:val="0"/>
+                <w:color w:val="0B2545"/>
+                <w:sz w:val="18"/>
+              </w:rPr>
+              <w:t>Comportamento equivalente para texto e voz.</w:t>
+            </w:r>
+          </w:p>
+        </w:tc>
+      </w:tr>
+      <w:tr>
+        <w:tc>
+          <w:tcPr>
+            <w:tcW w:type="dxa" w:w="1200"/>
+          </w:tcPr>
+          <w:p>
+            <w:pPr>
+              <w:spacing w:before="0" w:after="0" w:line="259" w:lineRule="auto"/>
+              <w:jc w:val="center"/>
+            </w:pPr>
+            <w:r/>
+            <w:r>
+              <w:rPr>
+                <w:rFonts w:ascii="Calibri" w:hAnsi="Calibri"/>
+                <w:b w:val="0"/>
+                <w:color w:val="0B2545"/>
+                <w:sz w:val="18"/>
+              </w:rPr>
+              <w:t>RNF-C08</w:t>
+            </w:r>
+          </w:p>
+        </w:tc>
+        <w:tc>
+          <w:tcPr>
+            <w:tcW w:type="dxa" w:w="8160"/>
+          </w:tcPr>
+          <w:p>
+            <w:pPr>
+              <w:spacing w:before="0" w:after="0" w:line="259" w:lineRule="auto"/>
+              <w:jc w:val="left"/>
+            </w:pPr>
+            <w:r/>
+            <w:r>
+              <w:rPr>
+                <w:rFonts w:ascii="Calibri" w:hAnsi="Calibri"/>
+                <w:b w:val="0"/>
+                <w:color w:val="0B2545"/>
+                <w:sz w:val="18"/>
+              </w:rPr>
+              <w:t>Lint, tipagem, testes e documentação atualizados.</w:t>
+            </w:r>
+          </w:p>
+        </w:tc>
+      </w:tr>
+      <w:tr>
+        <w:tc>
+          <w:tcPr>
+            <w:tcW w:type="dxa" w:w="1200"/>
+          </w:tcPr>
+          <w:p>
+            <w:pPr>
+              <w:spacing w:before="0" w:after="0" w:line="259" w:lineRule="auto"/>
+              <w:jc w:val="center"/>
+            </w:pPr>
+            <w:r/>
+            <w:r>
+              <w:rPr>
+                <w:rFonts w:ascii="Calibri" w:hAnsi="Calibri"/>
+                <w:b w:val="0"/>
+                <w:color w:val="0B2545"/>
+                <w:sz w:val="18"/>
+              </w:rPr>
+              <w:t>RNF-C09</w:t>
+            </w:r>
+          </w:p>
+        </w:tc>
+        <w:tc>
+          <w:tcPr>
+            <w:tcW w:type="dxa" w:w="8160"/>
+          </w:tcPr>
+          <w:p>
+            <w:pPr>
+              <w:spacing w:before="0" w:after="0" w:line="259" w:lineRule="auto"/>
+              <w:jc w:val="left"/>
+            </w:pPr>
+            <w:r/>
+            <w:r>
+              <w:rPr>
+                <w:rFonts w:ascii="Calibri" w:hAnsi="Calibri"/>
+                <w:b w:val="0"/>
+                <w:color w:val="0B2545"/>
+                <w:sz w:val="18"/>
+              </w:rPr>
+              <w:t>Falha de voz ou busca não impede uso básico por texto.</w:t>
+            </w:r>
+          </w:p>
+        </w:tc>
+      </w:tr>
+      <w:tr>
+        <w:tc>
+          <w:tcPr>
+            <w:tcW w:type="dxa" w:w="1200"/>
+          </w:tcPr>
+          <w:p>
+            <w:pPr>
+              <w:spacing w:before="0" w:after="0" w:line="259" w:lineRule="auto"/>
+              <w:jc w:val="center"/>
+            </w:pPr>
+            <w:r/>
+            <w:r>
+              <w:rPr>
+                <w:rFonts w:ascii="Calibri" w:hAnsi="Calibri"/>
+                <w:b w:val="0"/>
+                <w:color w:val="0B2545"/>
+                <w:sz w:val="18"/>
+              </w:rPr>
+              <w:t>RNF-C10</w:t>
+            </w:r>
+          </w:p>
+        </w:tc>
+        <w:tc>
+          <w:tcPr>
+            <w:tcW w:type="dxa" w:w="8160"/>
+          </w:tcPr>
+          <w:p>
+            <w:pPr>
+              <w:spacing w:before="0" w:after="0" w:line="259" w:lineRule="auto"/>
+              <w:jc w:val="left"/>
+            </w:pPr>
+            <w:r/>
+            <w:r>
+              <w:rPr>
+                <w:rFonts w:ascii="Calibri" w:hAnsi="Calibri"/>
+                <w:b w:val="0"/>
+                <w:color w:val="0B2545"/>
+                <w:sz w:val="18"/>
+              </w:rPr>
+              <w:t>Logs técnicos sem áudio, transcrição ou chaves.</w:t>
+            </w:r>
+          </w:p>
+        </w:tc>
+      </w:tr>
+    </w:tbl>
+    <w:p>
+      <w:pPr>
+        <w:spacing w:after="40"/>
+      </w:pPr>
+    </w:p>
+    <w:p>
+      <w:pPr>
+        <w:pStyle w:val="Heading3"/>
+        <w:keepNext/>
+      </w:pPr>
+      <w:r>
+        <w:t>User stories da segunda entrega</w:t>
+      </w:r>
+    </w:p>
+    <w:tbl>
+      <w:tblPr>
+        <w:tblW w:type="dxa" w:w="9360"/>
+        <w:jc w:val="left"/>
+        <w:tblLayout w:type="fixed"/>
+        <w:tblLook w:firstColumn="1" w:firstRow="1" w:lastColumn="0" w:lastRow="0" w:noHBand="0" w:noVBand="1" w:val="04A0"/>
+        <w:tblInd w:w="120" w:type="dxa"/>
+      </w:tblPr>
+      <w:tblGrid>
+        <w:gridCol w:w="1200"/>
+        <w:gridCol w:w="8160"/>
+      </w:tblGrid>
+      <w:tr>
+        <w:trPr>
+          <w:tblHeader w:val="true"/>
+        </w:trPr>
+        <w:tc>
+          <w:tcPr>
+            <w:tcW w:type="dxa" w:w="1200"/>
+            <w:vAlign w:val="center"/>
+            <w:tcMar>
+              <w:top w:w="80" w:type="dxa"/>
+              <w:start w:w="120" w:type="dxa"/>
+              <w:bottom w:w="80" w:type="dxa"/>
+              <w:end w:w="120" w:type="dxa"/>
+            </w:tcMar>
+            <w:shd w:fill="F2F4F7"/>
+          </w:tcPr>
+          <w:p>
+            <w:pPr>
+              <w:spacing w:before="0" w:after="0" w:line="259" w:lineRule="auto"/>
+              <w:jc w:val="center"/>
+            </w:pPr>
+            <w:r/>
+            <w:r>
+              <w:rPr>
+                <w:rFonts w:ascii="Calibri" w:hAnsi="Calibri"/>
+                <w:b/>
+                <w:color w:val="1F4D78"/>
+                <w:sz w:val="18"/>
+              </w:rPr>
+              <w:t>ID</w:t>
+            </w:r>
+          </w:p>
+        </w:tc>
+        <w:tc>
+          <w:tcPr>
+            <w:tcW w:type="dxa" w:w="8160"/>
+            <w:vAlign w:val="center"/>
+            <w:tcMar>
+              <w:top w:w="80" w:type="dxa"/>
+              <w:start w:w="120" w:type="dxa"/>
+              <w:bottom w:w="80" w:type="dxa"/>
+              <w:end w:w="120" w:type="dxa"/>
+            </w:tcMar>
+            <w:shd w:fill="F2F4F7"/>
+          </w:tcPr>
+          <w:p>
+            <w:pPr>
+              <w:spacing w:before="0" w:after="0" w:line="259" w:lineRule="auto"/>
+              <w:jc w:val="left"/>
+            </w:pPr>
+            <w:r/>
+            <w:r>
+              <w:rPr>
+                <w:rFonts w:ascii="Calibri" w:hAnsi="Calibri"/>
+                <w:b/>
+                <w:color w:val="1F4D78"/>
+                <w:sz w:val="18"/>
+              </w:rPr>
+              <w:t>User story</w:t>
+            </w:r>
+          </w:p>
+        </w:tc>
+      </w:tr>
+      <w:tr>
+        <w:tc>
+          <w:tcPr>
+            <w:tcW w:type="dxa" w:w="1200"/>
+          </w:tcPr>
+          <w:p>
+            <w:pPr>
+              <w:spacing w:before="0" w:after="0" w:line="259" w:lineRule="auto"/>
+              <w:jc w:val="center"/>
+            </w:pPr>
+            <w:r/>
+            <w:r>
+              <w:rPr>
+                <w:rFonts w:ascii="Calibri" w:hAnsi="Calibri"/>
+                <w:b w:val="0"/>
+                <w:color w:val="0B2545"/>
+                <w:sz w:val="18"/>
+              </w:rPr>
+              <w:t>US-C01</w:t>
+            </w:r>
+          </w:p>
+        </w:tc>
+        <w:tc>
+          <w:tcPr>
+            <w:tcW w:type="dxa" w:w="8160"/>
+          </w:tcPr>
+          <w:p>
+            <w:pPr>
+              <w:spacing w:before="0" w:after="0" w:line="259" w:lineRule="auto"/>
+              <w:jc w:val="left"/>
+            </w:pPr>
+            <w:r/>
+            <w:r>
+              <w:rPr>
+                <w:rFonts w:ascii="Calibri" w:hAnsi="Calibri"/>
+                <w:b w:val="0"/>
+                <w:color w:val="0B2545"/>
+                <w:sz w:val="18"/>
+              </w:rPr>
+              <w:t>Como cliente, quero iniciar conversa para encontrar e contratar um serviço.</w:t>
+            </w:r>
+          </w:p>
+        </w:tc>
+      </w:tr>
+      <w:tr>
+        <w:tc>
+          <w:tcPr>
+            <w:tcW w:type="dxa" w:w="1200"/>
+          </w:tcPr>
+          <w:p>
+            <w:pPr>
+              <w:spacing w:before="0" w:after="0" w:line="259" w:lineRule="auto"/>
+              <w:jc w:val="center"/>
+            </w:pPr>
+            <w:r/>
+            <w:r>
+              <w:rPr>
+                <w:rFonts w:ascii="Calibri" w:hAnsi="Calibri"/>
+                <w:b w:val="0"/>
+                <w:color w:val="0B2545"/>
+                <w:sz w:val="18"/>
+              </w:rPr>
+              <w:t>US-C02</w:t>
+            </w:r>
+          </w:p>
+        </w:tc>
+        <w:tc>
+          <w:tcPr>
+            <w:tcW w:type="dxa" w:w="8160"/>
+          </w:tcPr>
+          <w:p>
+            <w:pPr>
+              <w:spacing w:before="0" w:after="0" w:line="259" w:lineRule="auto"/>
+              <w:jc w:val="left"/>
+            </w:pPr>
+            <w:r/>
+            <w:r>
+              <w:rPr>
+                <w:rFonts w:ascii="Calibri" w:hAnsi="Calibri"/>
+                <w:b w:val="0"/>
+                <w:color w:val="0B2545"/>
+                <w:sz w:val="18"/>
+              </w:rPr>
+              <w:t>Como cliente, quero informar serviço, data e horário por texto ou voz.</w:t>
+            </w:r>
+          </w:p>
+        </w:tc>
+      </w:tr>
+      <w:tr>
+        <w:tc>
+          <w:tcPr>
+            <w:tcW w:type="dxa" w:w="1200"/>
+          </w:tcPr>
+          <w:p>
+            <w:pPr>
+              <w:spacing w:before="0" w:after="0" w:line="259" w:lineRule="auto"/>
+              <w:jc w:val="center"/>
+            </w:pPr>
+            <w:r/>
+            <w:r>
+              <w:rPr>
+                <w:rFonts w:ascii="Calibri" w:hAnsi="Calibri"/>
+                <w:b w:val="0"/>
+                <w:color w:val="0B2545"/>
+                <w:sz w:val="18"/>
+              </w:rPr>
+              <w:t>US-C03</w:t>
+            </w:r>
+          </w:p>
+        </w:tc>
+        <w:tc>
+          <w:tcPr>
+            <w:tcW w:type="dxa" w:w="8160"/>
+          </w:tcPr>
+          <w:p>
+            <w:pPr>
+              <w:spacing w:before="0" w:after="0" w:line="259" w:lineRule="auto"/>
+              <w:jc w:val="left"/>
+            </w:pPr>
+            <w:r/>
+            <w:r>
+              <w:rPr>
+                <w:rFonts w:ascii="Calibri" w:hAnsi="Calibri"/>
+                <w:b w:val="0"/>
+                <w:color w:val="0B2545"/>
+                <w:sz w:val="18"/>
+              </w:rPr>
+              <w:t>Como cliente, quero ver profissionais e horários compatíveis antes de confirmar.</w:t>
+            </w:r>
+          </w:p>
+        </w:tc>
+      </w:tr>
+      <w:tr>
+        <w:tc>
+          <w:tcPr>
+            <w:tcW w:type="dxa" w:w="1200"/>
+          </w:tcPr>
+          <w:p>
+            <w:pPr>
+              <w:spacing w:before="0" w:after="0" w:line="259" w:lineRule="auto"/>
+              <w:jc w:val="center"/>
+            </w:pPr>
+            <w:r/>
+            <w:r>
+              <w:rPr>
+                <w:rFonts w:ascii="Calibri" w:hAnsi="Calibri"/>
+                <w:b w:val="0"/>
+                <w:color w:val="0B2545"/>
+                <w:sz w:val="18"/>
+              </w:rPr>
+              <w:t>US-C04</w:t>
+            </w:r>
+          </w:p>
+        </w:tc>
+        <w:tc>
+          <w:tcPr>
+            <w:tcW w:type="dxa" w:w="8160"/>
+          </w:tcPr>
+          <w:p>
+            <w:pPr>
+              <w:spacing w:before="0" w:after="0" w:line="259" w:lineRule="auto"/>
+              <w:jc w:val="left"/>
+            </w:pPr>
+            <w:r/>
+            <w:r>
+              <w:rPr>
+                <w:rFonts w:ascii="Calibri" w:hAnsi="Calibri"/>
+                <w:b w:val="0"/>
+                <w:color w:val="0B2545"/>
+                <w:sz w:val="18"/>
+              </w:rPr>
+              <w:t>Como cliente, quero consultar meus agendamentos no chatbot.</w:t>
+            </w:r>
+          </w:p>
+        </w:tc>
+      </w:tr>
+      <w:tr>
+        <w:tc>
+          <w:tcPr>
+            <w:tcW w:type="dxa" w:w="1200"/>
+          </w:tcPr>
+          <w:p>
+            <w:pPr>
+              <w:spacing w:before="0" w:after="0" w:line="259" w:lineRule="auto"/>
+              <w:jc w:val="center"/>
+            </w:pPr>
+            <w:r/>
+            <w:r>
+              <w:rPr>
+                <w:rFonts w:ascii="Calibri" w:hAnsi="Calibri"/>
+                <w:b w:val="0"/>
+                <w:color w:val="0B2545"/>
+                <w:sz w:val="18"/>
+              </w:rPr>
+              <w:t>US-C05</w:t>
+            </w:r>
+          </w:p>
+        </w:tc>
+        <w:tc>
+          <w:tcPr>
+            <w:tcW w:type="dxa" w:w="8160"/>
+          </w:tcPr>
+          <w:p>
+            <w:pPr>
+              <w:spacing w:before="0" w:after="0" w:line="259" w:lineRule="auto"/>
+              <w:jc w:val="left"/>
+            </w:pPr>
+            <w:r/>
+            <w:r>
+              <w:rPr>
+                <w:rFonts w:ascii="Calibri" w:hAnsi="Calibri"/>
+                <w:b w:val="0"/>
+                <w:color w:val="0B2545"/>
+                <w:sz w:val="18"/>
+              </w:rPr>
+              <w:t>Como cliente, quero cancelar após confirmar a ação.</w:t>
+            </w:r>
+          </w:p>
+        </w:tc>
+      </w:tr>
+      <w:tr>
+        <w:tc>
+          <w:tcPr>
+            <w:tcW w:type="dxa" w:w="1200"/>
+          </w:tcPr>
+          <w:p>
+            <w:pPr>
+              <w:spacing w:before="0" w:after="0" w:line="259" w:lineRule="auto"/>
+              <w:jc w:val="center"/>
+            </w:pPr>
+            <w:r/>
+            <w:r>
+              <w:rPr>
+                <w:rFonts w:ascii="Calibri" w:hAnsi="Calibri"/>
+                <w:b w:val="0"/>
+                <w:color w:val="0B2545"/>
+                <w:sz w:val="18"/>
+              </w:rPr>
+              <w:t>US-C06</w:t>
+            </w:r>
+          </w:p>
+        </w:tc>
+        <w:tc>
+          <w:tcPr>
+            <w:tcW w:type="dxa" w:w="8160"/>
+          </w:tcPr>
+          <w:p>
+            <w:pPr>
+              <w:spacing w:before="0" w:after="0" w:line="259" w:lineRule="auto"/>
+              <w:jc w:val="left"/>
+            </w:pPr>
+            <w:r/>
+            <w:r>
+              <w:rPr>
+                <w:rFonts w:ascii="Calibri" w:hAnsi="Calibri"/>
+                <w:b w:val="0"/>
+                <w:color w:val="0B2545"/>
+                <w:sz w:val="18"/>
+              </w:rPr>
+              <w:t>Como cliente, quero remarcar para um horário disponível.</w:t>
+            </w:r>
+          </w:p>
+        </w:tc>
+      </w:tr>
+      <w:tr>
+        <w:tc>
+          <w:tcPr>
+            <w:tcW w:type="dxa" w:w="1200"/>
+          </w:tcPr>
+          <w:p>
+            <w:pPr>
+              <w:spacing w:before="0" w:after="0" w:line="259" w:lineRule="auto"/>
+              <w:jc w:val="center"/>
+            </w:pPr>
+            <w:r/>
+            <w:r>
+              <w:rPr>
+                <w:rFonts w:ascii="Calibri" w:hAnsi="Calibri"/>
+                <w:b w:val="0"/>
+                <w:color w:val="0B2545"/>
+                <w:sz w:val="18"/>
+              </w:rPr>
+              <w:t>US-C07</w:t>
+            </w:r>
+          </w:p>
+        </w:tc>
+        <w:tc>
+          <w:tcPr>
+            <w:tcW w:type="dxa" w:w="8160"/>
+          </w:tcPr>
+          <w:p>
+            <w:pPr>
+              <w:spacing w:before="0" w:after="0" w:line="259" w:lineRule="auto"/>
+              <w:jc w:val="left"/>
+            </w:pPr>
+            <w:r/>
+            <w:r>
+              <w:rPr>
+                <w:rFonts w:ascii="Calibri" w:hAnsi="Calibri"/>
+                <w:b w:val="0"/>
+                <w:color w:val="0B2545"/>
+                <w:sz w:val="18"/>
+              </w:rPr>
+              <w:t>Como cliente, quero manter contexto enquanto navego no aplicativo.</w:t>
+            </w:r>
+          </w:p>
+        </w:tc>
+      </w:tr>
+      <w:tr>
+        <w:tc>
+          <w:tcPr>
+            <w:tcW w:type="dxa" w:w="1200"/>
+          </w:tcPr>
+          <w:p>
+            <w:pPr>
+              <w:spacing w:before="0" w:after="0" w:line="259" w:lineRule="auto"/>
+              <w:jc w:val="center"/>
+            </w:pPr>
+            <w:r/>
+            <w:r>
+              <w:rPr>
+                <w:rFonts w:ascii="Calibri" w:hAnsi="Calibri"/>
+                <w:b w:val="0"/>
+                <w:color w:val="0B2545"/>
+                <w:sz w:val="18"/>
+              </w:rPr>
+              <w:t>US-C08</w:t>
+            </w:r>
+          </w:p>
+        </w:tc>
+        <w:tc>
+          <w:tcPr>
+            <w:tcW w:type="dxa" w:w="8160"/>
+          </w:tcPr>
+          <w:p>
+            <w:pPr>
+              <w:spacing w:before="0" w:after="0" w:line="259" w:lineRule="auto"/>
+              <w:jc w:val="left"/>
+            </w:pPr>
+            <w:r/>
+            <w:r>
+              <w:rPr>
+                <w:rFonts w:ascii="Calibri" w:hAnsi="Calibri"/>
+                <w:b w:val="0"/>
+                <w:color w:val="0B2545"/>
+                <w:sz w:val="18"/>
+              </w:rPr>
+              <w:t>Como cliente, quero receber mensagem clara e continuar digitando se a voz falhar.</w:t>
+            </w:r>
+          </w:p>
+        </w:tc>
+      </w:tr>
+      <w:tr>
+        <w:tc>
+          <w:tcPr>
+            <w:tcW w:type="dxa" w:w="1200"/>
+          </w:tcPr>
+          <w:p>
+            <w:pPr>
+              <w:spacing w:before="0" w:after="0" w:line="259" w:lineRule="auto"/>
+              <w:jc w:val="center"/>
+            </w:pPr>
+            <w:r/>
+            <w:r>
+              <w:rPr>
+                <w:rFonts w:ascii="Calibri" w:hAnsi="Calibri"/>
+                <w:b w:val="0"/>
+                <w:color w:val="0B2545"/>
+                <w:sz w:val="18"/>
+              </w:rPr>
+              <w:t>US-C09</w:t>
+            </w:r>
+          </w:p>
+        </w:tc>
+        <w:tc>
+          <w:tcPr>
+            <w:tcW w:type="dxa" w:w="8160"/>
+          </w:tcPr>
+          <w:p>
+            <w:pPr>
+              <w:spacing w:before="0" w:after="0" w:line="259" w:lineRule="auto"/>
+              <w:jc w:val="left"/>
+            </w:pPr>
+            <w:r/>
+            <w:r>
+              <w:rPr>
+                <w:rFonts w:ascii="Calibri" w:hAnsi="Calibri"/>
+                <w:b w:val="0"/>
+                <w:color w:val="0B2545"/>
+                <w:sz w:val="18"/>
+              </w:rPr>
+              <w:t>Como administradora, quero testes e documentação que comprovem qualidade e rastreabilidade.</w:t>
+            </w:r>
+          </w:p>
+        </w:tc>
+      </w:tr>
+    </w:tbl>
+    <w:p>
+      <w:pPr>
+        <w:spacing w:after="40"/>
+      </w:pPr>
+    </w:p>
+    <w:p>
+      <w:pPr>
+        <w:pStyle w:val="Heading3"/>
+        <w:keepNext/>
+      </w:pPr>
+      <w:r>
+        <w:t>Critérios de aceite da segunda entrega</w:t>
+      </w:r>
+    </w:p>
+    <w:p>
+      <w:pPr>
+        <w:ind w:left="360" w:hanging="360"/>
+      </w:pPr>
+      <w:r>
+        <w:rPr>
+          <w:rFonts w:ascii="Calibri" w:hAnsi="Calibri"/>
+          <w:b/>
+          <w:color w:val="1F4D78"/>
+          <w:sz w:val="21"/>
+        </w:rPr>
+        <w:t xml:space="preserve">CA-C01  </w:t>
+      </w:r>
+      <w:r>
+        <w:rPr>
+          <w:rFonts w:ascii="Calibri" w:hAnsi="Calibri"/>
+          <w:color w:val="0B2545"/>
+          <w:sz w:val="21"/>
+        </w:rPr>
+        <w:t>“Quero agendar uma limpeza amanhã às 14h” inicia a coleta de dados e valida disponibilidade.</w:t>
+      </w:r>
+    </w:p>
+    <w:p>
+      <w:pPr>
+        <w:ind w:left="360" w:hanging="360"/>
+      </w:pPr>
+      <w:r>
+        <w:rPr>
+          <w:rFonts w:ascii="Calibri" w:hAnsi="Calibri"/>
+          <w:b/>
+          <w:color w:val="1F4D78"/>
+          <w:sz w:val="21"/>
+        </w:rPr>
+        <w:t xml:space="preserve">CA-C02  </w:t>
+      </w:r>
+      <w:r>
+        <w:rPr>
+          <w:rFonts w:ascii="Calibri" w:hAnsi="Calibri"/>
+          <w:color w:val="0B2545"/>
+          <w:sz w:val="21"/>
+        </w:rPr>
+        <w:t>“Quais são meus agendamentos?” mostra somente os agendamentos do usuário autenticado.</w:t>
+      </w:r>
+    </w:p>
+    <w:p>
+      <w:pPr>
+        <w:ind w:left="360" w:hanging="360"/>
+      </w:pPr>
+      <w:r>
+        <w:rPr>
+          <w:rFonts w:ascii="Calibri" w:hAnsi="Calibri"/>
+          <w:b/>
+          <w:color w:val="1F4D78"/>
+          <w:sz w:val="21"/>
+        </w:rPr>
+        <w:t xml:space="preserve">CA-C03  </w:t>
+      </w:r>
+      <w:r>
+        <w:rPr>
+          <w:rFonts w:ascii="Calibri" w:hAnsi="Calibri"/>
+          <w:color w:val="0B2545"/>
+          <w:sz w:val="21"/>
+        </w:rPr>
+        <w:t>“Cancelar agendamento 15” pede confirmação antes de alterar o banco.</w:t>
+      </w:r>
+    </w:p>
+    <w:p>
+      <w:pPr>
+        <w:ind w:left="360" w:hanging="360"/>
+      </w:pPr>
+      <w:r>
+        <w:rPr>
+          <w:rFonts w:ascii="Calibri" w:hAnsi="Calibri"/>
+          <w:b/>
+          <w:color w:val="1F4D78"/>
+          <w:sz w:val="21"/>
+        </w:rPr>
+        <w:t xml:space="preserve">CA-C04  </w:t>
+      </w:r>
+      <w:r>
+        <w:rPr>
+          <w:rFonts w:ascii="Calibri" w:hAnsi="Calibri"/>
+          <w:color w:val="0B2545"/>
+          <w:sz w:val="21"/>
+        </w:rPr>
+        <w:t>“Trocar meu horário” solicita o novo horário e valida disponibilidade antes da confirmação.</w:t>
+      </w:r>
+    </w:p>
+    <w:p>
+      <w:pPr>
+        <w:ind w:left="360" w:hanging="360"/>
+      </w:pPr>
+      <w:r>
+        <w:rPr>
+          <w:rFonts w:ascii="Calibri" w:hAnsi="Calibri"/>
+          <w:b/>
+          <w:color w:val="1F4D78"/>
+          <w:sz w:val="21"/>
+        </w:rPr>
+        <w:t xml:space="preserve">CA-C05  </w:t>
+      </w:r>
+      <w:r>
+        <w:rPr>
+          <w:rFonts w:ascii="Calibri" w:hAnsi="Calibri"/>
+          <w:color w:val="0B2545"/>
+          <w:sz w:val="21"/>
+        </w:rPr>
+        <w:t>O mesmo fluxo opera quando a frase vem de voz ou de texto.</w:t>
+      </w:r>
+    </w:p>
+    <w:p>
+      <w:pPr>
+        <w:ind w:left="360" w:hanging="360"/>
+      </w:pPr>
+      <w:r>
+        <w:rPr>
+          <w:rFonts w:ascii="Calibri" w:hAnsi="Calibri"/>
+          <w:b/>
+          <w:color w:val="1F4D78"/>
+          <w:sz w:val="21"/>
+        </w:rPr>
+        <w:t xml:space="preserve">CA-C06  </w:t>
+      </w:r>
+      <w:r>
+        <w:rPr>
+          <w:rFonts w:ascii="Calibri" w:hAnsi="Calibri"/>
+          <w:color w:val="0B2545"/>
+          <w:sz w:val="21"/>
+        </w:rPr>
+        <w:t>Reenvio após falha de rede não duplica uma ação.</w:t>
+      </w:r>
+    </w:p>
+    <w:p>
+      <w:pPr>
+        <w:ind w:left="360" w:hanging="360"/>
+      </w:pPr>
+      <w:r>
+        <w:rPr>
+          <w:rFonts w:ascii="Calibri" w:hAnsi="Calibri"/>
+          <w:b/>
+          <w:color w:val="1F4D78"/>
+          <w:sz w:val="21"/>
+        </w:rPr>
+        <w:t xml:space="preserve">CA-C07  </w:t>
+      </w:r>
+      <w:r>
+        <w:rPr>
+          <w:rFonts w:ascii="Calibri" w:hAnsi="Calibri"/>
+          <w:color w:val="0B2545"/>
+          <w:sz w:val="21"/>
+        </w:rPr>
+        <w:t>Fluxo demonstrável em web e Android, com roteiro de testes e documentação.</w:t>
+      </w:r>
     </w:p>
     <w:sectPr>
       <w:headerReference w:type="default" r:id="rId9"/>

</xml_diff>